<commit_message>
Cap nhat file Word
</commit_message>
<xml_diff>
--- a/He_thong_thong_tin_giai_quyet_hanh_chinh/LE THI HOAI THANH_25410307/LeThiHoaiThanh_25410307.docx
+++ b/He_thong_thong_tin_giai_quyet_hanh_chinh/LE THI HOAI THANH_25410307/LeThiHoaiThanh_25410307.docx
@@ -1,6 +1,6 @@
 
 <file path=word/document.xml><?xml version="1.0" encoding="utf-8"?>
-<w:document xmlns:wpc="http://schemas.microsoft.com/office/word/2010/wordprocessingCanvas" xmlns:cx="http://schemas.microsoft.com/office/drawing/2014/chartex" xmlns:cx1="http://schemas.microsoft.com/office/drawing/2015/9/8/chartex" xmlns:cx2="http://schemas.microsoft.com/office/drawing/2015/10/21/chartex" xmlns:cx3="http://schemas.microsoft.com/office/drawing/2016/5/9/chartex" xmlns:cx4="http://schemas.microsoft.com/office/drawing/2016/5/10/chartex" xmlns:cx5="http://schemas.microsoft.com/office/drawing/2016/5/11/chartex" xmlns:cx6="http://schemas.microsoft.com/office/drawing/2016/5/12/chartex" xmlns:cx7="http://schemas.microsoft.com/office/drawing/2016/5/13/chartex" xmlns:cx8="http://schemas.microsoft.com/office/drawing/2016/5/14/chartex" xmlns:mc="http://schemas.openxmlformats.org/markup-compatibility/2006" xmlns:aink="http://schemas.microsoft.com/office/drawing/2016/ink" xmlns:am3d="http://schemas.microsoft.com/office/drawing/2017/model3d" xmlns:o="urn:schemas-microsoft-com:office:office" xmlns:oel="http://schemas.microsoft.com/office/2019/extlst" xmlns:r="http://schemas.openxmlformats.org/officeDocument/2006/relationships" xmlns:m="http://schemas.openxmlformats.org/officeDocument/2006/math" xmlns:v="urn:schemas-microsoft-com:vml" xmlns:wp14="http://schemas.microsoft.com/office/word/2010/wordprocessingDrawing" xmlns:wp="http://schemas.openxmlformats.org/drawingml/2006/wordprocessingDrawing" xmlns:w10="urn:schemas-microsoft-com:office:word" xmlns:w="http://schemas.openxmlformats.org/wordprocessingml/2006/main" xmlns:w14="http://schemas.microsoft.com/office/word/2010/wordml" xmlns:w15="http://schemas.microsoft.com/office/word/2012/wordml" xmlns:w16cex="http://schemas.microsoft.com/office/word/2018/wordml/cex" xmlns:w16cid="http://schemas.microsoft.com/office/word/2016/wordml/cid" xmlns:w16="http://schemas.microsoft.com/office/word/2018/wordml" xmlns:w16du="http://schemas.microsoft.com/office/word/2023/wordml/word16du" xmlns:w16sdtdh="http://schemas.microsoft.com/office/word/2020/wordml/sdtdatahash" xmlns:w16sdtfl="http://schemas.microsoft.com/office/word/2024/wordml/sdtformatlock" xmlns:w16se="http://schemas.microsoft.com/office/word/2015/wordml/symex" xmlns:wpg="http://schemas.microsoft.com/office/word/2010/wordprocessingGroup" xmlns:wpi="http://schemas.microsoft.com/office/word/2010/wordprocessingInk" xmlns:wne="http://schemas.microsoft.com/office/word/2006/wordml" xmlns:wps="http://schemas.microsoft.com/office/word/2010/wordprocessingShape" mc:Ignorable="w14 w15 w16se w16cid w16 w16cex w16sdtdh w16sdtfl w16du wp14">
+<w:document xmlns:wpc="http://schemas.microsoft.com/office/word/2010/wordprocessingCanvas" xmlns:cx="http://schemas.microsoft.com/office/drawing/2014/chartex" xmlns:mc="http://schemas.openxmlformats.org/markup-compatibility/2006" xmlns:o="urn:schemas-microsoft-com:office:office" xmlns:r="http://schemas.openxmlformats.org/officeDocument/2006/relationships" xmlns:m="http://schemas.openxmlformats.org/officeDocument/2006/math" xmlns:v="urn:schemas-microsoft-com:vml" xmlns:wp14="http://schemas.microsoft.com/office/word/2010/wordprocessingDrawing" xmlns:wp="http://schemas.openxmlformats.org/drawingml/2006/wordprocessingDrawing" xmlns:w10="urn:schemas-microsoft-com:office:word" xmlns:w="http://schemas.openxmlformats.org/wordprocessingml/2006/main" xmlns:w14="http://schemas.microsoft.com/office/word/2010/wordml" xmlns:w15="http://schemas.microsoft.com/office/word/2012/wordml" xmlns:w16se="http://schemas.microsoft.com/office/word/2015/wordml/symex" xmlns:wpg="http://schemas.microsoft.com/office/word/2010/wordprocessingGroup" xmlns:wpi="http://schemas.microsoft.com/office/word/2010/wordprocessingInk" xmlns:wne="http://schemas.microsoft.com/office/word/2006/wordml" xmlns:wps="http://schemas.microsoft.com/office/word/2010/wordprocessingShape" mc:Ignorable="w14 w15 w16se wp14">
   <w:body>
     <w:p>
       <w:pPr>
@@ -1931,10 +1931,20 @@
     </w:p>
     <w:p>
       <w:pPr>
-        <w:pStyle w:val="Heading1"/>
+        <w:jc w:val="center"/>
+        <w:rPr>
+          <w:b/>
+          <w:sz w:val="30"/>
+          <w:szCs w:val="30"/>
+        </w:rPr>
       </w:pPr>
       <w:bookmarkStart w:id="2" w:name="_Toc162996926"/>
       <w:r>
+        <w:rPr>
+          <w:b/>
+          <w:sz w:val="30"/>
+          <w:szCs w:val="30"/>
+        </w:rPr>
         <w:lastRenderedPageBreak/>
         <w:t>TÓM TẮT</w:t>
       </w:r>
@@ -1942,289 +1952,6 @@
     </w:p>
     <w:p>
       <w:pPr>
-        <w:rPr>
-          <w:rFonts w:cs="Times New Roman"/>
-          <w:szCs w:val="26"/>
-        </w:rPr>
-      </w:pPr>
-      <w:r>
-        <w:rPr>
-          <w:rFonts w:cs="Times New Roman"/>
-          <w:szCs w:val="26"/>
-        </w:rPr>
-        <w:tab/>
-      </w:r>
-      <w:r>
-        <w:rPr>
-          <w:rFonts w:cs="Times New Roman"/>
-          <w:szCs w:val="26"/>
-        </w:rPr>
-        <w:t xml:space="preserve">Trong những năm gần đây, nhu cầu thực hiện thủ tục hành chính của người dân và tổ chức ngày càng tăng. Tuy nhiên, quá trình tiếp nhận và giải quyết hồ sơ tại một số cơ quan vẫn còn gặp nhiều khó khăn như thời gian xử lý kéo dài, hồ sơ bị thiếu hoặc sai thông tin, người dân khó theo dõi tiến độ và cán bộ mất nhiều thời gian trong việc quản lý giấy tờ. Vì vậy, việc xây dựng </w:t>
-      </w:r>
-      <w:r>
-        <w:rPr>
-          <w:rFonts w:cs="Times New Roman"/>
-          <w:b/>
-          <w:bCs/>
-          <w:szCs w:val="26"/>
-        </w:rPr>
-        <w:t>Hệ thống thông tin giải quyết thủ tục hành chính</w:t>
-      </w:r>
-      <w:r>
-        <w:rPr>
-          <w:rFonts w:cs="Times New Roman"/>
-          <w:szCs w:val="26"/>
-        </w:rPr>
-        <w:t xml:space="preserve"> là cần thiết nhằm hỗ trợ đơn giản hóa quy trình, nâng cao hiệu quả xử lý hồ sơ và cải thiện chất lượng phục vụ người dân.</w:t>
-      </w:r>
-    </w:p>
-    <w:p>
-      <w:pPr>
-        <w:ind w:firstLine="720"/>
-        <w:rPr>
-          <w:rFonts w:cs="Times New Roman"/>
-          <w:szCs w:val="26"/>
-        </w:rPr>
-      </w:pPr>
-      <w:r>
-        <w:rPr>
-          <w:rFonts w:cs="Times New Roman"/>
-          <w:szCs w:val="26"/>
-        </w:rPr>
-        <w:t>Đồ án này tập trung nghiên cứu và phân tích quy trình giải quyết thủ tục hành chính, từ khi người dân tra cứu thông tin, chuẩn bị và nộp hồ sơ cho đến khi cơ quan tiếp nhận, kiểm tra, xử lý và trả kết quả. Thông qua việc tìm hiểu tài liệu, khảo sát quy trình thực tế và sử dụng mô hình BPMN để mô hình hóa quy trình, nhóm tiến hành xác định các đối tượng tham gia, các bước xử lý, thông tin cần quản lý và những vấn đề còn tồn tại trong quá trình thực hiện thủ tục hành chính.</w:t>
-      </w:r>
-    </w:p>
-    <w:p>
-      <w:pPr>
-        <w:ind w:firstLine="720"/>
-        <w:rPr>
-          <w:rFonts w:cs="Times New Roman"/>
-          <w:szCs w:val="26"/>
-        </w:rPr>
-      </w:pPr>
-      <w:r>
-        <w:rPr>
-          <w:rFonts w:cs="Times New Roman"/>
-          <w:szCs w:val="26"/>
-        </w:rPr>
-        <w:t>Kết quả nghiên cứu cho thấy hệ thống có thể hỗ trợ người dân tra cứu thủ tục, nộp hồ sơ trực tuyến, bổ sung giấy tờ, theo dõi trạng thái xử lý và nhận thông báo kết quả. Đối với cán bộ, hệ thống hỗ trợ tiếp nhận, kiểm tra, phân loại, chuyển hồ sơ đến bộ phận phụ trách, cập nhật tiến độ và trả kết quả cho người dân. Ngoài ra, hệ thống còn hỗ trợ quản lý tài khoản, lưu trữ hồ sơ, thống kê số lượng hồ sơ và lập báo cáo phục vụ công tác quản lý.</w:t>
-      </w:r>
-    </w:p>
-    <w:p>
-      <w:pPr>
-        <w:ind w:firstLine="720"/>
-        <w:rPr>
-          <w:rFonts w:cs="Times New Roman"/>
-          <w:szCs w:val="26"/>
-        </w:rPr>
-      </w:pPr>
-      <w:r>
-        <w:rPr>
-          <w:rFonts w:cs="Times New Roman"/>
-          <w:szCs w:val="26"/>
-        </w:rPr>
-        <w:t>Thông qua đồ án, nhóm mong muốn đề xuất một hệ thống có tính ứng dụng thực tế, góp phần giảm bớt các công việc thủ công, hạn chế sai sót và rút ngắn thời gian giải quyết hồ sơ. Hệ thống không chỉ giúp nâng cao tính minh bạch trong quá trình xử lý thủ tục hành chính mà còn tạo điều kiện thuận lợi cho người dân, tổ chức và cán bộ trong quá trình sử dụng. Kết quả của đồ án cũng có thể được sử dụng làm tài liệu tham khảo cho việc nghiên cứu, xây dựng và cải tiến các hệ thống thông tin hành chính trong tương lai.</w:t>
-      </w:r>
-    </w:p>
-    <w:p>
-      <w:pPr>
-        <w:rPr>
-          <w:rFonts w:cs="Times New Roman"/>
-          <w:szCs w:val="26"/>
-        </w:rPr>
-      </w:pPr>
-    </w:p>
-    <w:p>
-      <w:pPr>
-        <w:rPr>
-          <w:rFonts w:cs="Times New Roman"/>
-          <w:szCs w:val="26"/>
-        </w:rPr>
-      </w:pPr>
-    </w:p>
-    <w:p>
-      <w:pPr>
-        <w:rPr>
-          <w:rFonts w:cs="Times New Roman"/>
-          <w:szCs w:val="26"/>
-        </w:rPr>
-      </w:pPr>
-    </w:p>
-    <w:p>
-      <w:pPr>
-        <w:rPr>
-          <w:rFonts w:cs="Times New Roman"/>
-          <w:szCs w:val="26"/>
-        </w:rPr>
-      </w:pPr>
-    </w:p>
-    <w:p>
-      <w:pPr>
-        <w:rPr>
-          <w:rFonts w:cs="Times New Roman"/>
-          <w:szCs w:val="26"/>
-        </w:rPr>
-      </w:pPr>
-    </w:p>
-    <w:p>
-      <w:pPr>
-        <w:rPr>
-          <w:rFonts w:cs="Times New Roman"/>
-          <w:szCs w:val="26"/>
-        </w:rPr>
-      </w:pPr>
-    </w:p>
-    <w:p>
-      <w:pPr>
-        <w:pStyle w:val="Heading1"/>
-      </w:pPr>
-      <w:r>
-        <w:lastRenderedPageBreak/>
-        <w:t>MỞ ĐẦU</w:t>
-      </w:r>
-    </w:p>
-    <w:p>
-      <w:pPr>
-        <w:ind w:firstLine="720"/>
-      </w:pPr>
-      <w:r>
-        <w:t>Trong quá trình thực hiện các thủ tục hành chính, người dân và tổ chức thường phải cung cấp nhiều loại giấy tờ, trải qua nhiều bước kiểm tra và chờ đợi kết quả từ cơ quan có thẩm quyền. Nếu quá trình tiếp nhận và xử lý hồ sơ chưa được quản lý hiệu quả, người dân có thể gặp khó khăn trong việc tra cứu thông tin, theo dõi tiến độ và bổ sung hồ sơ khi có yêu cầu.</w:t>
-      </w:r>
-    </w:p>
-    <w:p>
-      <w:pPr>
-        <w:ind w:firstLine="720"/>
-      </w:pPr>
-      <w:r>
-        <w:t>Bên cạnh đó, cán bộ phụ trách cũng phải thực hiện nhiều công việc như tiếp nhận, kiểm tra, phân loại, chuyển hồ sơ và cập nhật kết quả xử lý. Việc quản lý hồ sơ bằng các phương pháp thủ công có thể gây mất nhiều thời gian, khó kiểm soát tiến độ và dễ xảy ra sai sót trong quá trình thực hiện.</w:t>
-      </w:r>
-    </w:p>
-    <w:p>
-      <w:pPr>
-        <w:ind w:firstLine="720"/>
-      </w:pPr>
-      <w:r>
-        <w:t xml:space="preserve">Từ thực tế đó, nhóm lựa chọn đề tài </w:t>
-      </w:r>
-      <w:r>
-        <w:rPr>
-          <w:b/>
-          <w:bCs/>
-        </w:rPr>
-        <w:t>“Hệ thống thông tin giải quyết thủ tục hành chính”</w:t>
-      </w:r>
-      <w:r>
-        <w:t xml:space="preserve"> để nghiên cứu cách tổ chức và quản lý quy trình giải quyết hồ sơ. Đề tài hướng đến việc xây dựng mô hình thể hiện rõ các bước công việc, các đối tượng tham gia và sự trao đổi thông tin giữa người dân với cơ quan hành chính.</w:t>
-      </w:r>
-    </w:p>
-    <w:p>
-      <w:pPr>
-        <w:ind w:firstLine="720"/>
-      </w:pPr>
-      <w:r>
-        <w:t>Mục tiêu chính của đồ án là tìm hiểu quy trình giải quyết thủ tục hành chính, xác định các yêu cầu của hệ thống và mô hình hóa quy trình nghiệp vụ bằng BPMN. Trên cơ sở đó, nhóm đề xuất các chức năng phù hợp nhằm hỗ trợ việc tiếp nhận, xử lý, theo dõi và trả kết quả hồ sơ.</w:t>
-      </w:r>
-    </w:p>
-    <w:p>
-      <w:pPr>
-        <w:ind w:firstLine="720"/>
-      </w:pPr>
-      <w:r>
-        <w:t>Phạm vi của đề tài tập trung vào quá trình giải quyết một hồ sơ hành chính, bắt đầu từ khi người dân tra cứu và nộp hồ sơ cho đến khi nhận được kết quả. Trong quá trình thực hiện, nhóm sử dụng các phương pháp như nghiên cứu tài liệu, khảo sát quy trình, phân tích yêu cầu và mô hình hóa nghiệp vụ.</w:t>
-      </w:r>
-    </w:p>
-    <w:p>
-      <w:pPr>
-        <w:ind w:firstLine="720"/>
-      </w:pPr>
-      <w:r>
-        <w:t>.</w:t>
-      </w:r>
-    </w:p>
-    <w:p/>
-    <w:p>
-      <w:pPr>
-        <w:jc w:val="center"/>
-        <w:rPr>
-          <w:rFonts w:cs="Times New Roman"/>
-          <w:szCs w:val="26"/>
-        </w:rPr>
-      </w:pPr>
-    </w:p>
-    <w:p>
-      <w:pPr>
-        <w:rPr>
-          <w:rFonts w:cs="Times New Roman"/>
-          <w:szCs w:val="26"/>
-        </w:rPr>
-      </w:pPr>
-    </w:p>
-    <w:p>
-      <w:pPr>
-        <w:rPr>
-          <w:rFonts w:cs="Times New Roman"/>
-          <w:szCs w:val="26"/>
-        </w:rPr>
-      </w:pPr>
-      <w:r>
-        <w:rPr>
-          <w:rFonts w:cs="Times New Roman"/>
-          <w:szCs w:val="26"/>
-        </w:rPr>
-        <w:br w:type="page"/>
-      </w:r>
-    </w:p>
-    <w:p>
-      <w:pPr>
-        <w:pStyle w:val="Heading1"/>
-      </w:pPr>
-      <w:bookmarkStart w:id="3" w:name="_Toc162996927"/>
-      <w:r>
-        <w:lastRenderedPageBreak/>
-        <w:t xml:space="preserve">Chương I. </w:t>
-      </w:r>
-      <w:r>
-        <w:t>TỔNG QUAN</w:t>
-      </w:r>
-      <w:r>
-        <w:t>.</w:t>
-      </w:r>
-      <w:bookmarkEnd w:id="3"/>
-    </w:p>
-    <w:p>
-      <w:pPr>
-        <w:pStyle w:val="Heading2"/>
-      </w:pPr>
-      <w:bookmarkStart w:id="4" w:name="_Toc162996928"/>
-      <w:r>
-        <w:t xml:space="preserve">1. </w:t>
-      </w:r>
-      <w:r>
-        <w:t>Giới thiệu</w:t>
-      </w:r>
-      <w:r>
-        <w:t xml:space="preserve"> đề tài</w:t>
-      </w:r>
-      <w:r>
-        <w:t>.</w:t>
-      </w:r>
-      <w:bookmarkEnd w:id="4"/>
-    </w:p>
-    <w:p>
-      <w:pPr>
-        <w:pStyle w:val="Heading3"/>
-      </w:pPr>
-      <w:bookmarkStart w:id="5" w:name="_Toc162996929"/>
-      <w:r>
-        <w:t>1.1. Tiểu mục</w:t>
-      </w:r>
-      <w:r>
-        <w:t xml:space="preserve"> nếu cần thiết.</w:t>
-      </w:r>
-      <w:bookmarkEnd w:id="5"/>
-    </w:p>
-    <w:p>
-      <w:pPr>
         <w:ind w:firstLine="720"/>
         <w:jc w:val="both"/>
         <w:rPr>
@@ -2237,14 +1964,182 @@
           <w:rFonts w:cs="Times New Roman"/>
           <w:szCs w:val="26"/>
         </w:rPr>
-        <w:t>Các nội dung</w:t>
-      </w:r>
-      <w:r>
-        <w:rPr>
-          <w:rFonts w:cs="Times New Roman"/>
-          <w:szCs w:val="26"/>
-        </w:rPr>
-        <w:t xml:space="preserve"> trong mục này nên trả lời được cho các câu hỏi:</w:t>
+        <w:t>Hệ thống thông tin giải quyết thủ tụ</w:t>
+      </w:r>
+      <w:r>
+        <w:rPr>
+          <w:rFonts w:cs="Times New Roman"/>
+          <w:szCs w:val="26"/>
+        </w:rPr>
+        <w:t>c hành chính</w:t>
+      </w:r>
+      <w:r>
+        <w:rPr>
+          <w:rFonts w:cs="Times New Roman"/>
+          <w:szCs w:val="26"/>
+        </w:rPr>
+        <w:t xml:space="preserve"> với mục tiêu phân tích, mô hình hóa và đề xuất quy trình giải quyết thủ tục hành chính phù hợp với yêu cầu quản lý hiện nay. Đồ án tập trung nghiên cứu toàn bộ quy trình từ khi người dân tra cứu thông tin, chuẩn bị và nộp hồ sơ, cơ quan tiếp nhận, kiểm tra tính hợp lệ, xử lý, phê duyệt cho đến khi trả kết quả và lưu trữ hồ sơ.</w:t>
+      </w:r>
+    </w:p>
+    <w:p>
+      <w:pPr>
+        <w:ind w:firstLine="720"/>
+        <w:jc w:val="both"/>
+        <w:rPr>
+          <w:rFonts w:cs="Times New Roman"/>
+          <w:szCs w:val="26"/>
+        </w:rPr>
+      </w:pPr>
+      <w:r>
+        <w:rPr>
+          <w:rFonts w:cs="Times New Roman"/>
+          <w:szCs w:val="26"/>
+        </w:rPr>
+        <w:t>Trong quá trình thực hiện, nhóm sử dụng phương pháp khảo sát quy trình thực tế, nghiên cứu tài liệu và áp dụng mô hình BPMN (Business Process Model and Notation) để mô hình hóa các quy trình nghiệp vụ. Trên cơ sở đó, nhóm xác định các đối tượng tham gia, luồng công việc, luồng thông tin, các điểm quyết định và những hạn chế còn tồn tại trong quy trình hiện tại, từ đó đề xuất quy trình được chuẩn hóa và phù hợp với việc triển khai trên hệ thống thông tin.</w:t>
+      </w:r>
+    </w:p>
+    <w:p>
+      <w:pPr>
+        <w:ind w:firstLine="720"/>
+        <w:jc w:val="both"/>
+        <w:rPr>
+          <w:rFonts w:cs="Times New Roman"/>
+          <w:szCs w:val="26"/>
+        </w:rPr>
+      </w:pPr>
+      <w:r>
+        <w:rPr>
+          <w:rFonts w:cs="Times New Roman"/>
+          <w:szCs w:val="26"/>
+        </w:rPr>
+        <w:t>Kết quả của đồ án là mô hình quy trình giải quyết thủ tục hành chính được xây dựng theo hướng khoa học, rõ ràng và có khả năng ứng dụng trong thực tế. Hệ thống hỗ trợ người dân tra cứu thông tin, nộp và theo dõi hồ sơ, đồng thời hỗ trợ cán bộ trong việc tiếp nhận, xử lý, cập nhật trạng thái, quản lý hồ sơ và lập báo cáo thống kê. Đồ án góp phần nâng cao hiệu quả quản lý, giảm thời gian xử lý hồ sơ, hạn chế sai sót trong quá trình thực hiện thủ tục hành chính và là tài liệu tham khảo cho việc nghiên cứu, xây dựng và cải tiến các hệ thống thông tin phục vụ quản lý quy trình nghiệp vụ trong lĩnh vực hành chính công.</w:t>
+      </w:r>
+    </w:p>
+    <w:p>
+      <w:pPr>
+        <w:pStyle w:val="Heading1"/>
+      </w:pPr>
+      <w:bookmarkStart w:id="3" w:name="_Toc162996927"/>
+      <w:r>
+        <w:t xml:space="preserve">Chương I. </w:t>
+      </w:r>
+      <w:r>
+        <w:t>TỔNG QUAN</w:t>
+      </w:r>
+      <w:r>
+        <w:t>.</w:t>
+      </w:r>
+      <w:bookmarkEnd w:id="3"/>
+    </w:p>
+    <w:p>
+      <w:pPr>
+        <w:pStyle w:val="Heading2"/>
+      </w:pPr>
+      <w:bookmarkStart w:id="4" w:name="_Toc162996928"/>
+      <w:r>
+        <w:t xml:space="preserve">1. </w:t>
+      </w:r>
+      <w:r>
+        <w:t>Giới thiệu</w:t>
+      </w:r>
+      <w:r>
+        <w:t xml:space="preserve"> đề tài</w:t>
+      </w:r>
+      <w:r>
+        <w:t>.</w:t>
+      </w:r>
+      <w:bookmarkEnd w:id="4"/>
+    </w:p>
+    <w:p>
+      <w:pPr>
+        <w:pStyle w:val="Heading3"/>
+      </w:pPr>
+      <w:bookmarkStart w:id="5" w:name="_Toc162996929"/>
+      <w:r>
+        <w:t xml:space="preserve">1.1. </w:t>
+      </w:r>
+      <w:bookmarkEnd w:id="5"/>
+      <w:r>
+        <w:t>Lý do chọn đề tài</w:t>
+      </w:r>
+    </w:p>
+    <w:p>
+      <w:pPr>
+        <w:jc w:val="both"/>
+      </w:pPr>
+      <w:r>
+        <w:tab/>
+      </w:r>
+      <w:r>
+        <w:t>Trong những năm gần đây, cùng với quá trình sắp xếp, sáp nhập các đơn vị hành chính theo chủ trương của Nhà nước,</w:t>
+      </w:r>
+      <w:bookmarkStart w:id="6" w:name="_GoBack"/>
+      <w:bookmarkEnd w:id="6"/>
+      <w:r>
+        <w:t xml:space="preserve"> công tác quản lý và giải quyết thủ tục hành chính đứng trước nhiều thay đổi. Việc hợp nhất các địa phương không chỉ làm tăng khối lượng thông tin cần quản lý mà còn đặt ra yêu cầu đồng bộ dữ liệu về dân cư, hồ sơ và các loại giấy tờ hành chính giữa các đơn vị. </w:t>
+      </w:r>
+    </w:p>
+    <w:p>
+      <w:pPr>
+        <w:ind w:firstLine="720"/>
+        <w:jc w:val="both"/>
+      </w:pPr>
+      <w:r>
+        <w:t xml:space="preserve">Trước sáp nhập, người dân chủ yếu thực hiện thủ tục hành chính trực tiếp tại cơ quan nhà nước thuộc địa phương nơi cư trú, trong khi dữ liệu được quản lý tương đối độc lập theo từng đơn vị hành chính. </w:t>
+      </w:r>
+    </w:p>
+    <w:p>
+      <w:pPr>
+        <w:ind w:firstLine="720"/>
+        <w:jc w:val="both"/>
+      </w:pPr>
+      <w:r>
+        <w:t xml:space="preserve">Sau khi sáp nhập, phạm vi quản lý được mở rộng, thông tin của người dân cần được cập nhật và chia sẻ trên hệ thống dữ liệu điện tử thống nhất. Điều này đòi hỏi các quy trình giải quyết thủ tục hành chính, bao gồm cả hình thức trực tiếp và trực tuyến, </w:t>
+      </w:r>
+      <w:r>
+        <w:lastRenderedPageBreak/>
+        <w:t xml:space="preserve">phải được rà soát, chuẩn hóa và thiết kế lại nhằm bảo đảm tính thống nhất, hạn chế sai sót trong quá trình xử lý hồ sơ, đồng thời tạo thuận lợi cho người dân và cơ quan quản lý. </w:t>
+      </w:r>
+    </w:p>
+    <w:p>
+      <w:pPr>
+        <w:ind w:firstLine="720"/>
+        <w:jc w:val="both"/>
+      </w:pPr>
+      <w:r>
+        <w:t xml:space="preserve">Thực tế cho thấy, quá trình tiếp nhận và giải quyết hồ sơ tại nhiều cơ quan vẫn còn tồn tại những hạn chế như thời gian xử lý kéo dài, hồ sơ thiếu hoặc sai thông tin, dữ liệu chưa được đồng bộ, người dân gặp khó khăn trong việc theo dõi tiến độ xử lý và cán bộ mất nhiều thời gian trong việc quản lý hồ sơ. Xuất phát từ thực tiễn đó, việc nghiên cứu và xây dựng hệ thống thông tin giải quyết thủ tục hành chính trở nên cần thiết nhằm hỗ trợ quản lý thống nhất thông tin, chuẩn hóa quy trình nghiệp vụ, đồng thời đáp ứng nhu cầu giải quyết thủ tục hành chính theo cả hình thức trực tiếp và trực tuyến trong bối cảnh hiện nay. </w:t>
+      </w:r>
+    </w:p>
+    <w:p>
+      <w:pPr>
+        <w:ind w:firstLine="720"/>
+        <w:jc w:val="both"/>
+      </w:pPr>
+      <w:r>
+        <w:t>Thông qua đồ án, nhóm mong muốn đề xuất một hệ thống có tính ứng dụng thực tế, góp phần giảm bớt các công việc thủ công, hạn chế sai sót và rút ngắn thời gian giải quyết hồ sơ. Hệ thống không chỉ giúp nâng cao tính minh bạch trong quá trình xử lý thủ tục hành chính mà còn tạo điều kiện thuận lợi cho người dân, tổ chức và cán bộ trong quá trình sử dụng. Kết quả của đồ án cũng có thể được sử dụng làm tài liệu tham khảo cho việc nghiên cứu, xây dựng và cải tiến các hệ thống thông tin hành chính trong tương lai.</w:t>
+      </w:r>
+    </w:p>
+    <w:p>
+      <w:pPr>
+        <w:pStyle w:val="Heading3"/>
+      </w:pPr>
+      <w:r>
+        <w:t>1.2</w:t>
+      </w:r>
+      <w:r>
+        <w:t>.</w:t>
+      </w:r>
+      <w:r>
+        <w:t xml:space="preserve"> Mục tiêu nghiên cứu</w:t>
+      </w:r>
+    </w:p>
+    <w:p>
+      <w:pPr>
+        <w:ind w:firstLine="720"/>
+        <w:jc w:val="both"/>
+      </w:pPr>
+      <w:r>
+        <w:t>Đồ án được thực hiện nhằm nghiên cứu và phân tích quy trình giải quyết thủ tục hành chính theo cả hình thức trực tiếp và trực tuyến, từ đó xây dựng mô hình quy trình phù hợp với yêu cầu quản lý hiện nay. Cụ thể, đồ án hướng đến các mục tiêu sau:</w:t>
       </w:r>
     </w:p>
     <w:p>
@@ -2252,19 +2147,13 @@
         <w:pStyle w:val="ListParagraph"/>
         <w:numPr>
           <w:ilvl w:val="0"/>
-          <w:numId w:val="3"/>
+          <w:numId w:val="10"/>
         </w:numPr>
-        <w:rPr>
-          <w:rFonts w:cs="Times New Roman"/>
-          <w:szCs w:val="26"/>
-        </w:rPr>
-      </w:pPr>
-      <w:r>
-        <w:rPr>
-          <w:rFonts w:cs="Times New Roman"/>
-          <w:szCs w:val="26"/>
-        </w:rPr>
-        <w:t>Nội dung chính của đề tài đồ án là gì?</w:t>
+        <w:ind w:left="1134"/>
+        <w:jc w:val="both"/>
+      </w:pPr>
+      <w:r>
+        <w:t>Phân tích quy trình giải quyết thủ tục hành chính hiện tại và xác định các vấn đề còn tồn tại.</w:t>
       </w:r>
     </w:p>
     <w:p>
@@ -2272,26 +2161,13 @@
         <w:pStyle w:val="ListParagraph"/>
         <w:numPr>
           <w:ilvl w:val="0"/>
-          <w:numId w:val="3"/>
+          <w:numId w:val="10"/>
         </w:numPr>
-        <w:rPr>
-          <w:rFonts w:cs="Times New Roman"/>
-          <w:szCs w:val="26"/>
-        </w:rPr>
-      </w:pPr>
-      <w:r>
-        <w:rPr>
-          <w:rFonts w:cs="Times New Roman"/>
-          <w:szCs w:val="26"/>
-        </w:rPr>
-        <w:t xml:space="preserve">Lý do </w:t>
-      </w:r>
-      <w:r>
-        <w:rPr>
-          <w:rFonts w:cs="Times New Roman"/>
-          <w:szCs w:val="26"/>
-        </w:rPr>
-        <w:t>nhóm chọn thực hiện đề tài là gì?</w:t>
+        <w:ind w:left="1134"/>
+        <w:jc w:val="both"/>
+      </w:pPr>
+      <w:r>
+        <w:t>Mô hình hóa quy trình nghiệp vụ bằng ngôn ngữ BPMN.</w:t>
       </w:r>
     </w:p>
     <w:p>
@@ -2299,30 +2175,282 @@
         <w:pStyle w:val="ListParagraph"/>
         <w:numPr>
           <w:ilvl w:val="0"/>
-          <w:numId w:val="3"/>
+          <w:numId w:val="10"/>
         </w:numPr>
-        <w:rPr>
-          <w:rFonts w:cs="Times New Roman"/>
-          <w:szCs w:val="26"/>
-        </w:rPr>
-      </w:pPr>
-      <w:r>
-        <w:rPr>
-          <w:rFonts w:cs="Times New Roman"/>
-          <w:szCs w:val="26"/>
-        </w:rPr>
-        <w:t>Đề tài có liên quan đến nội dung môn học như thế nào?</w:t>
+        <w:ind w:left="1134"/>
+        <w:jc w:val="both"/>
+      </w:pPr>
+      <w:r>
+        <w:t>Đề xuất hệ thống thông tin hỗ trợ quản lý, tiếp nhận và xử lý hồ sơ hành chính.</w:t>
+      </w:r>
+    </w:p>
+    <w:p>
+      <w:pPr>
+        <w:pStyle w:val="ListParagraph"/>
+        <w:numPr>
+          <w:ilvl w:val="0"/>
+          <w:numId w:val="10"/>
+        </w:numPr>
+        <w:ind w:left="1134"/>
+        <w:jc w:val="both"/>
+      </w:pPr>
+      <w:r>
+        <w:t>Chuẩn hóa quy trình nhằm nâng cao hiệu quả xử lý, giảm thời gian thực hiện và hạn chế sai sót.</w:t>
+      </w:r>
+    </w:p>
+    <w:p>
+      <w:pPr>
+        <w:pStyle w:val="ListParagraph"/>
+        <w:numPr>
+          <w:ilvl w:val="0"/>
+          <w:numId w:val="10"/>
+        </w:numPr>
+        <w:ind w:left="1134"/>
+        <w:jc w:val="both"/>
+      </w:pPr>
+      <w:r>
+        <w:t>Hỗ trợ người dân và cơ quan quản lý trong việc thực hiện thủ tục hành chính theo cả hình thức trực tiếp và trực tuyến.</w:t>
       </w:r>
     </w:p>
     <w:p>
       <w:pPr>
         <w:pStyle w:val="Heading3"/>
       </w:pPr>
-      <w:bookmarkStart w:id="6" w:name="_Toc162996930"/>
-      <w:r>
-        <w:t>1.2. Tiểu mục khác.</w:t>
-      </w:r>
-      <w:bookmarkEnd w:id="6"/>
+      <w:r>
+        <w:t xml:space="preserve">1.3. </w:t>
+      </w:r>
+      <w:r>
+        <w:t>Đối tượng và phạm vi nghiêm cứu</w:t>
+      </w:r>
+    </w:p>
+    <w:p>
+      <w:pPr>
+        <w:jc w:val="both"/>
+      </w:pPr>
+      <w:r>
+        <w:t xml:space="preserve"> </w:t>
+      </w:r>
+      <w:r>
+        <w:tab/>
+      </w:r>
+      <w:r>
+        <w:rPr>
+          <w:b/>
+        </w:rPr>
+        <w:t>Đối tượng nghiên cứ</w:t>
+      </w:r>
+      <w:r>
+        <w:rPr>
+          <w:b/>
+        </w:rPr>
+        <w:t>u:</w:t>
+      </w:r>
+      <w:r>
+        <w:t xml:space="preserve"> Q</w:t>
+      </w:r>
+      <w:r>
+        <w:t>uy trình giải quyết thủ tục hành chính tại Ủy ban nhân dân (UBND) và hệ thống thông tin hỗ trợ quản lý các quy trình này. Đồ án tập trung nghiên cứu các hoạt động tiếp nhận, kiểm tra, xử lý, phê duyệt và trả kết quả hồ sơ hành chính giữa người dân và UBND, đồng thời phân tích luồng công việc, luồng thông tin và các tác nhân tham gia trong quá trình giải quyết thủ tục hành chính.</w:t>
+      </w:r>
+    </w:p>
+    <w:p>
+      <w:pPr>
+        <w:ind w:firstLine="720"/>
+        <w:jc w:val="both"/>
+      </w:pPr>
+      <w:r>
+        <w:rPr>
+          <w:b/>
+        </w:rPr>
+        <w:lastRenderedPageBreak/>
+        <w:t>Phạm vi nghiên cứu</w:t>
+      </w:r>
+      <w:r>
+        <w:t>:</w:t>
+      </w:r>
+      <w:r>
+        <w:t xml:space="preserve"> </w:t>
+      </w:r>
+      <w:r>
+        <w:t xml:space="preserve">Giới </w:t>
+      </w:r>
+      <w:r>
+        <w:t>hạn trong các quy trình giải quyết thủ tục hành chính được thực hiện tại UBND, bao gồm cả hình thức tiếp nhận hồ sơ trực tiếp và trực tuyến. Nội dung nghiên cứu tập trung vào việc phân tích quy trình hiện trạng, mô hình hóa bằng BPMN, xác định những hạn chế trong quá trình xử lý hồ sơ và đề xuất quy trình cải tiến cùng hệ thống thông tin hỗ trợ quản lý. Đồ án không đi sâu vào việc phát triển phần mềm hoàn chỉnh hay triển khai thực tế tại một đơn vị hành chính cụ thể.</w:t>
+      </w:r>
+    </w:p>
+    <w:p>
+      <w:pPr>
+        <w:pStyle w:val="Heading3"/>
+      </w:pPr>
+      <w:r>
+        <w:t>1.4. Phương pháp nghiên cứu</w:t>
+      </w:r>
+    </w:p>
+    <w:p>
+      <w:pPr>
+        <w:spacing w:line="240" w:lineRule="auto"/>
+        <w:ind w:firstLine="720"/>
+      </w:pPr>
+      <w:r>
+        <w:t>Để thực hiện đồ án, nhóm sử dụng các phương pháp nghiên cứ</w:t>
+      </w:r>
+      <w:r>
+        <w:t>u sau:</w:t>
+      </w:r>
+    </w:p>
+    <w:p>
+      <w:pPr>
+        <w:pStyle w:val="ListParagraph"/>
+        <w:numPr>
+          <w:ilvl w:val="0"/>
+          <w:numId w:val="15"/>
+        </w:numPr>
+        <w:spacing w:line="240" w:lineRule="auto"/>
+        <w:ind w:left="1276" w:hanging="425"/>
+      </w:pPr>
+      <w:r>
+        <w:t>Nghiên cứu tài liệu: Tìm hiểu các văn bản pháp luật, tài liệu chuyên ngành về quản trị quy trình nghiệp vụ (BPM), hệ thống thông tin và thủ tục hành chính.</w:t>
+      </w:r>
+    </w:p>
+    <w:p>
+      <w:pPr>
+        <w:pStyle w:val="ListParagraph"/>
+        <w:numPr>
+          <w:ilvl w:val="0"/>
+          <w:numId w:val="15"/>
+        </w:numPr>
+        <w:spacing w:line="240" w:lineRule="auto"/>
+        <w:ind w:left="1276" w:hanging="425"/>
+      </w:pPr>
+      <w:r>
+        <w:t>Khảo sát quy trình thực tế: Thu thập thông tin về quy trình giải quyết thủ tục hành chính hiện nay để xác định các bước thực hiện và những tồn tại cần cải tiến.</w:t>
+      </w:r>
+    </w:p>
+    <w:p>
+      <w:pPr>
+        <w:pStyle w:val="ListParagraph"/>
+        <w:numPr>
+          <w:ilvl w:val="0"/>
+          <w:numId w:val="15"/>
+        </w:numPr>
+        <w:spacing w:line="240" w:lineRule="auto"/>
+        <w:ind w:left="1276" w:hanging="425"/>
+      </w:pPr>
+      <w:r>
+        <w:t>Mô hình hóa quy trình: Sử dụng ngôn ngữ BPMN để mô hình hóa quy trình hiện tại và quy trình đề xuất.</w:t>
+      </w:r>
+    </w:p>
+    <w:p>
+      <w:pPr>
+        <w:pStyle w:val="ListParagraph"/>
+        <w:numPr>
+          <w:ilvl w:val="0"/>
+          <w:numId w:val="15"/>
+        </w:numPr>
+        <w:spacing w:line="240" w:lineRule="auto"/>
+        <w:ind w:left="1276" w:hanging="425"/>
+      </w:pPr>
+      <w:r>
+        <w:t>Phân tích và đánh giá: So sánh quy trình hiện tại với quy trình sau khi cải tiến nhằm đánh giá hiệu quả của hệ thống thông tin được đề xuất.</w:t>
+      </w:r>
+    </w:p>
+    <w:p>
+      <w:pPr>
+        <w:pStyle w:val="Heading3"/>
+      </w:pPr>
+      <w:r>
+        <w:t>1.5. Cấu trúc đồ án</w:t>
+      </w:r>
+    </w:p>
+    <w:p>
+      <w:pPr>
+        <w:jc w:val="both"/>
+      </w:pPr>
+      <w:r>
+        <w:t>Đồ án được xây dựng gồm bốn chương, ngoài phần Tóm tắt, Danh sách hình, bảng, Mục lục và Nguồn tham khảo. Nội dung của từng chương đượ</w:t>
+      </w:r>
+      <w:r>
+        <w:t>c trình bày như sau:</w:t>
+      </w:r>
+    </w:p>
+    <w:p>
+      <w:pPr>
+        <w:pStyle w:val="ListParagraph"/>
+        <w:numPr>
+          <w:ilvl w:val="0"/>
+          <w:numId w:val="16"/>
+        </w:numPr>
+        <w:ind w:left="851" w:hanging="567"/>
+        <w:jc w:val="both"/>
+      </w:pPr>
+      <w:r>
+        <w:rPr>
+          <w:b/>
+        </w:rPr>
+        <w:t>Chương I. Tổng quan:</w:t>
+      </w:r>
+      <w:r>
+        <w:t xml:space="preserve"> Trình bày bối cảnh, lý do chọn đề tài, mục tiêu nghiên cứu, đối tượng và phạm vi nghiên cứu, phương pháp nghiên cứu, đồng thời giới thiệu các cơ sở lý thuyết liên quan đến hệ thống thông tin, quản trị quy trình nghiệp vụ và mô hình hóa quy trình bằng BPMN.</w:t>
+      </w:r>
+    </w:p>
+    <w:p>
+      <w:pPr>
+        <w:pStyle w:val="ListParagraph"/>
+        <w:numPr>
+          <w:ilvl w:val="0"/>
+          <w:numId w:val="16"/>
+        </w:numPr>
+        <w:ind w:left="851" w:hanging="567"/>
+        <w:jc w:val="both"/>
+      </w:pPr>
+      <w:r>
+        <w:rPr>
+          <w:b/>
+        </w:rPr>
+        <w:t>Chương II. Thiết kế hệ thống:</w:t>
+      </w:r>
+      <w:r>
+        <w:t xml:space="preserve"> Phân tích quy trình giải quyết thủ tục hành chính tại UBND, xác định các tác nhân tham gia, mô hình hóa quy trình nghiệp vụ, thiết kế các chức năng của hệ thống, mô hình dữ liệu và các thành phần phục vụ việc xây dựng hệ thống thông tin.</w:t>
+      </w:r>
+    </w:p>
+    <w:p>
+      <w:pPr>
+        <w:pStyle w:val="ListParagraph"/>
+        <w:numPr>
+          <w:ilvl w:val="0"/>
+          <w:numId w:val="16"/>
+        </w:numPr>
+        <w:ind w:left="851" w:hanging="567"/>
+        <w:jc w:val="both"/>
+      </w:pPr>
+      <w:r>
+        <w:rPr>
+          <w:b/>
+        </w:rPr>
+        <w:t>Chương III. Triển khai hệ thống:</w:t>
+      </w:r>
+      <w:r>
+        <w:t xml:space="preserve"> Trình bày quá trình xây dựng và triển khai hệ thống, mô tả giao diện, các chức năng chính của hệ thống, đồng thời minh họa quá trình thực hiện quy trình giải quyết thủ tục hành chính theo cả hình thức trực tiếp và trực tuyến.</w:t>
+      </w:r>
+    </w:p>
+    <w:p>
+      <w:pPr>
+        <w:pStyle w:val="ListParagraph"/>
+        <w:numPr>
+          <w:ilvl w:val="0"/>
+          <w:numId w:val="16"/>
+        </w:numPr>
+        <w:ind w:left="851" w:hanging="567"/>
+        <w:jc w:val="both"/>
+      </w:pPr>
+      <w:r>
+        <w:rPr>
+          <w:b/>
+        </w:rPr>
+        <w:t>Chương IV. Kết luận:</w:t>
+      </w:r>
+      <w:r>
+        <w:t xml:space="preserve"> Tổng kết những kết quả đạt được của đồ án, đánh giá những ưu điểm, hạn chế của hệ thống và đề xuất hướng phát triển trong tương lai.</w:t>
+      </w:r>
     </w:p>
     <w:p>
       <w:pPr>
@@ -2330,6 +2458,7 @@
       </w:pPr>
       <w:bookmarkStart w:id="7" w:name="_Toc162996931"/>
       <w:r>
+        <w:lastRenderedPageBreak/>
         <w:t>2. Cơ sở lý thuyết.</w:t>
       </w:r>
       <w:bookmarkEnd w:id="7"/>
@@ -2750,7 +2879,7 @@
 </file>
 
 <file path=word/endnotes.xml><?xml version="1.0" encoding="utf-8"?>
-<w:endnotes xmlns:wpc="http://schemas.microsoft.com/office/word/2010/wordprocessingCanvas" xmlns:cx="http://schemas.microsoft.com/office/drawing/2014/chartex" xmlns:cx1="http://schemas.microsoft.com/office/drawing/2015/9/8/chartex" xmlns:cx2="http://schemas.microsoft.com/office/drawing/2015/10/21/chartex" xmlns:cx3="http://schemas.microsoft.com/office/drawing/2016/5/9/chartex" xmlns:cx4="http://schemas.microsoft.com/office/drawing/2016/5/10/chartex" xmlns:cx5="http://schemas.microsoft.com/office/drawing/2016/5/11/chartex" xmlns:cx6="http://schemas.microsoft.com/office/drawing/2016/5/12/chartex" xmlns:cx7="http://schemas.microsoft.com/office/drawing/2016/5/13/chartex" xmlns:cx8="http://schemas.microsoft.com/office/drawing/2016/5/14/chartex" xmlns:mc="http://schemas.openxmlformats.org/markup-compatibility/2006" xmlns:aink="http://schemas.microsoft.com/office/drawing/2016/ink" xmlns:am3d="http://schemas.microsoft.com/office/drawing/2017/model3d" xmlns:o="urn:schemas-microsoft-com:office:office" xmlns:oel="http://schemas.microsoft.com/office/2019/extlst" xmlns:r="http://schemas.openxmlformats.org/officeDocument/2006/relationships" xmlns:m="http://schemas.openxmlformats.org/officeDocument/2006/math" xmlns:v="urn:schemas-microsoft-com:vml" xmlns:wp14="http://schemas.microsoft.com/office/word/2010/wordprocessingDrawing" xmlns:wp="http://schemas.openxmlformats.org/drawingml/2006/wordprocessingDrawing" xmlns:w10="urn:schemas-microsoft-com:office:word" xmlns:w="http://schemas.openxmlformats.org/wordprocessingml/2006/main" xmlns:w14="http://schemas.microsoft.com/office/word/2010/wordml" xmlns:w15="http://schemas.microsoft.com/office/word/2012/wordml" xmlns:w16cex="http://schemas.microsoft.com/office/word/2018/wordml/cex" xmlns:w16cid="http://schemas.microsoft.com/office/word/2016/wordml/cid" xmlns:w16="http://schemas.microsoft.com/office/word/2018/wordml" xmlns:w16du="http://schemas.microsoft.com/office/word/2023/wordml/word16du" xmlns:w16sdtdh="http://schemas.microsoft.com/office/word/2020/wordml/sdtdatahash" xmlns:w16sdtfl="http://schemas.microsoft.com/office/word/2024/wordml/sdtformatlock" xmlns:w16se="http://schemas.microsoft.com/office/word/2015/wordml/symex" xmlns:wpg="http://schemas.microsoft.com/office/word/2010/wordprocessingGroup" xmlns:wpi="http://schemas.microsoft.com/office/word/2010/wordprocessingInk" xmlns:wne="http://schemas.microsoft.com/office/word/2006/wordml" xmlns:wps="http://schemas.microsoft.com/office/word/2010/wordprocessingShape" mc:Ignorable="w14 w15 w16se w16cid w16 w16cex w16sdtdh w16sdtfl w16du wp14">
+<w:endnotes xmlns:wpc="http://schemas.microsoft.com/office/word/2010/wordprocessingCanvas" xmlns:cx="http://schemas.microsoft.com/office/drawing/2014/chartex" xmlns:mc="http://schemas.openxmlformats.org/markup-compatibility/2006" xmlns:o="urn:schemas-microsoft-com:office:office" xmlns:r="http://schemas.openxmlformats.org/officeDocument/2006/relationships" xmlns:m="http://schemas.openxmlformats.org/officeDocument/2006/math" xmlns:v="urn:schemas-microsoft-com:vml" xmlns:wp14="http://schemas.microsoft.com/office/word/2010/wordprocessingDrawing" xmlns:wp="http://schemas.openxmlformats.org/drawingml/2006/wordprocessingDrawing" xmlns:w10="urn:schemas-microsoft-com:office:word" xmlns:w="http://schemas.openxmlformats.org/wordprocessingml/2006/main" xmlns:w14="http://schemas.microsoft.com/office/word/2010/wordml" xmlns:w15="http://schemas.microsoft.com/office/word/2012/wordml" xmlns:w16se="http://schemas.microsoft.com/office/word/2015/wordml/symex" xmlns:wpg="http://schemas.microsoft.com/office/word/2010/wordprocessingGroup" xmlns:wpi="http://schemas.microsoft.com/office/word/2010/wordprocessingInk" xmlns:wne="http://schemas.microsoft.com/office/word/2006/wordml" xmlns:wps="http://schemas.microsoft.com/office/word/2010/wordprocessingShape" mc:Ignorable="w14 w15 w16se wp14">
   <w:endnote w:type="separator" w:id="-1">
     <w:p>
       <w:pPr>
@@ -2775,7 +2904,7 @@
 </file>
 
 <file path=word/footer1.xml><?xml version="1.0" encoding="utf-8"?>
-<w:ftr xmlns:wpc="http://schemas.microsoft.com/office/word/2010/wordprocessingCanvas" xmlns:cx="http://schemas.microsoft.com/office/drawing/2014/chartex" xmlns:cx1="http://schemas.microsoft.com/office/drawing/2015/9/8/chartex" xmlns:cx2="http://schemas.microsoft.com/office/drawing/2015/10/21/chartex" xmlns:cx3="http://schemas.microsoft.com/office/drawing/2016/5/9/chartex" xmlns:cx4="http://schemas.microsoft.com/office/drawing/2016/5/10/chartex" xmlns:cx5="http://schemas.microsoft.com/office/drawing/2016/5/11/chartex" xmlns:cx6="http://schemas.microsoft.com/office/drawing/2016/5/12/chartex" xmlns:cx7="http://schemas.microsoft.com/office/drawing/2016/5/13/chartex" xmlns:cx8="http://schemas.microsoft.com/office/drawing/2016/5/14/chartex" xmlns:mc="http://schemas.openxmlformats.org/markup-compatibility/2006" xmlns:aink="http://schemas.microsoft.com/office/drawing/2016/ink" xmlns:am3d="http://schemas.microsoft.com/office/drawing/2017/model3d" xmlns:o="urn:schemas-microsoft-com:office:office" xmlns:oel="http://schemas.microsoft.com/office/2019/extlst" xmlns:r="http://schemas.openxmlformats.org/officeDocument/2006/relationships" xmlns:m="http://schemas.openxmlformats.org/officeDocument/2006/math" xmlns:v="urn:schemas-microsoft-com:vml" xmlns:wp14="http://schemas.microsoft.com/office/word/2010/wordprocessingDrawing" xmlns:wp="http://schemas.openxmlformats.org/drawingml/2006/wordprocessingDrawing" xmlns:w10="urn:schemas-microsoft-com:office:word" xmlns:w="http://schemas.openxmlformats.org/wordprocessingml/2006/main" xmlns:w14="http://schemas.microsoft.com/office/word/2010/wordml" xmlns:w15="http://schemas.microsoft.com/office/word/2012/wordml" xmlns:w16cex="http://schemas.microsoft.com/office/word/2018/wordml/cex" xmlns:w16cid="http://schemas.microsoft.com/office/word/2016/wordml/cid" xmlns:w16="http://schemas.microsoft.com/office/word/2018/wordml" xmlns:w16du="http://schemas.microsoft.com/office/word/2023/wordml/word16du" xmlns:w16sdtdh="http://schemas.microsoft.com/office/word/2020/wordml/sdtdatahash" xmlns:w16sdtfl="http://schemas.microsoft.com/office/word/2024/wordml/sdtformatlock" xmlns:w16se="http://schemas.microsoft.com/office/word/2015/wordml/symex" xmlns:wpg="http://schemas.microsoft.com/office/word/2010/wordprocessingGroup" xmlns:wpi="http://schemas.microsoft.com/office/word/2010/wordprocessingInk" xmlns:wne="http://schemas.microsoft.com/office/word/2006/wordml" xmlns:wps="http://schemas.microsoft.com/office/word/2010/wordprocessingShape" mc:Ignorable="w14 w15 w16se w16cid w16 w16cex w16sdtdh w16sdtfl w16du wp14">
+<w:ftr xmlns:wpc="http://schemas.microsoft.com/office/word/2010/wordprocessingCanvas" xmlns:cx="http://schemas.microsoft.com/office/drawing/2014/chartex" xmlns:mc="http://schemas.openxmlformats.org/markup-compatibility/2006" xmlns:o="urn:schemas-microsoft-com:office:office" xmlns:r="http://schemas.openxmlformats.org/officeDocument/2006/relationships" xmlns:m="http://schemas.openxmlformats.org/officeDocument/2006/math" xmlns:v="urn:schemas-microsoft-com:vml" xmlns:wp14="http://schemas.microsoft.com/office/word/2010/wordprocessingDrawing" xmlns:wp="http://schemas.openxmlformats.org/drawingml/2006/wordprocessingDrawing" xmlns:w10="urn:schemas-microsoft-com:office:word" xmlns:w="http://schemas.openxmlformats.org/wordprocessingml/2006/main" xmlns:w14="http://schemas.microsoft.com/office/word/2010/wordml" xmlns:w15="http://schemas.microsoft.com/office/word/2012/wordml" xmlns:w16se="http://schemas.microsoft.com/office/word/2015/wordml/symex" xmlns:wpg="http://schemas.microsoft.com/office/word/2010/wordprocessingGroup" xmlns:wpi="http://schemas.microsoft.com/office/word/2010/wordprocessingInk" xmlns:wne="http://schemas.microsoft.com/office/word/2006/wordml" xmlns:wps="http://schemas.microsoft.com/office/word/2010/wordprocessingShape" mc:Ignorable="w14 w15 w16se wp14">
   <w:sdt>
     <w:sdtPr>
       <w:id w:val="365795399"/>
@@ -2822,7 +2951,7 @@
             <w:noProof/>
             <w:szCs w:val="26"/>
           </w:rPr>
-          <w:t>2</w:t>
+          <w:t>6</w:t>
         </w:r>
         <w:r>
           <w:rPr>
@@ -2843,7 +2972,7 @@
 </file>
 
 <file path=word/footnotes.xml><?xml version="1.0" encoding="utf-8"?>
-<w:footnotes xmlns:wpc="http://schemas.microsoft.com/office/word/2010/wordprocessingCanvas" xmlns:cx="http://schemas.microsoft.com/office/drawing/2014/chartex" xmlns:cx1="http://schemas.microsoft.com/office/drawing/2015/9/8/chartex" xmlns:cx2="http://schemas.microsoft.com/office/drawing/2015/10/21/chartex" xmlns:cx3="http://schemas.microsoft.com/office/drawing/2016/5/9/chartex" xmlns:cx4="http://schemas.microsoft.com/office/drawing/2016/5/10/chartex" xmlns:cx5="http://schemas.microsoft.com/office/drawing/2016/5/11/chartex" xmlns:cx6="http://schemas.microsoft.com/office/drawing/2016/5/12/chartex" xmlns:cx7="http://schemas.microsoft.com/office/drawing/2016/5/13/chartex" xmlns:cx8="http://schemas.microsoft.com/office/drawing/2016/5/14/chartex" xmlns:mc="http://schemas.openxmlformats.org/markup-compatibility/2006" xmlns:aink="http://schemas.microsoft.com/office/drawing/2016/ink" xmlns:am3d="http://schemas.microsoft.com/office/drawing/2017/model3d" xmlns:o="urn:schemas-microsoft-com:office:office" xmlns:oel="http://schemas.microsoft.com/office/2019/extlst" xmlns:r="http://schemas.openxmlformats.org/officeDocument/2006/relationships" xmlns:m="http://schemas.openxmlformats.org/officeDocument/2006/math" xmlns:v="urn:schemas-microsoft-com:vml" xmlns:wp14="http://schemas.microsoft.com/office/word/2010/wordprocessingDrawing" xmlns:wp="http://schemas.openxmlformats.org/drawingml/2006/wordprocessingDrawing" xmlns:w10="urn:schemas-microsoft-com:office:word" xmlns:w="http://schemas.openxmlformats.org/wordprocessingml/2006/main" xmlns:w14="http://schemas.microsoft.com/office/word/2010/wordml" xmlns:w15="http://schemas.microsoft.com/office/word/2012/wordml" xmlns:w16cex="http://schemas.microsoft.com/office/word/2018/wordml/cex" xmlns:w16cid="http://schemas.microsoft.com/office/word/2016/wordml/cid" xmlns:w16="http://schemas.microsoft.com/office/word/2018/wordml" xmlns:w16du="http://schemas.microsoft.com/office/word/2023/wordml/word16du" xmlns:w16sdtdh="http://schemas.microsoft.com/office/word/2020/wordml/sdtdatahash" xmlns:w16sdtfl="http://schemas.microsoft.com/office/word/2024/wordml/sdtformatlock" xmlns:w16se="http://schemas.microsoft.com/office/word/2015/wordml/symex" xmlns:wpg="http://schemas.microsoft.com/office/word/2010/wordprocessingGroup" xmlns:wpi="http://schemas.microsoft.com/office/word/2010/wordprocessingInk" xmlns:wne="http://schemas.microsoft.com/office/word/2006/wordml" xmlns:wps="http://schemas.microsoft.com/office/word/2010/wordprocessingShape" mc:Ignorable="w14 w15 w16se w16cid w16 w16cex w16sdtdh w16sdtfl w16du wp14">
+<w:footnotes xmlns:wpc="http://schemas.microsoft.com/office/word/2010/wordprocessingCanvas" xmlns:cx="http://schemas.microsoft.com/office/drawing/2014/chartex" xmlns:mc="http://schemas.openxmlformats.org/markup-compatibility/2006" xmlns:o="urn:schemas-microsoft-com:office:office" xmlns:r="http://schemas.openxmlformats.org/officeDocument/2006/relationships" xmlns:m="http://schemas.openxmlformats.org/officeDocument/2006/math" xmlns:v="urn:schemas-microsoft-com:vml" xmlns:wp14="http://schemas.microsoft.com/office/word/2010/wordprocessingDrawing" xmlns:wp="http://schemas.openxmlformats.org/drawingml/2006/wordprocessingDrawing" xmlns:w10="urn:schemas-microsoft-com:office:word" xmlns:w="http://schemas.openxmlformats.org/wordprocessingml/2006/main" xmlns:w14="http://schemas.microsoft.com/office/word/2010/wordml" xmlns:w15="http://schemas.microsoft.com/office/word/2012/wordml" xmlns:w16se="http://schemas.microsoft.com/office/word/2015/wordml/symex" xmlns:wpg="http://schemas.microsoft.com/office/word/2010/wordprocessingGroup" xmlns:wpi="http://schemas.microsoft.com/office/word/2010/wordprocessingInk" xmlns:wne="http://schemas.microsoft.com/office/word/2006/wordml" xmlns:wps="http://schemas.microsoft.com/office/word/2010/wordprocessingShape" mc:Ignorable="w14 w15 w16se wp14">
   <w:footnote w:type="separator" w:id="-1">
     <w:p>
       <w:pPr>
@@ -2868,7 +2997,7 @@
 </file>
 
 <file path=word/header1.xml><?xml version="1.0" encoding="utf-8"?>
-<w:hdr xmlns:wpc="http://schemas.microsoft.com/office/word/2010/wordprocessingCanvas" xmlns:cx="http://schemas.microsoft.com/office/drawing/2014/chartex" xmlns:cx1="http://schemas.microsoft.com/office/drawing/2015/9/8/chartex" xmlns:cx2="http://schemas.microsoft.com/office/drawing/2015/10/21/chartex" xmlns:cx3="http://schemas.microsoft.com/office/drawing/2016/5/9/chartex" xmlns:cx4="http://schemas.microsoft.com/office/drawing/2016/5/10/chartex" xmlns:cx5="http://schemas.microsoft.com/office/drawing/2016/5/11/chartex" xmlns:cx6="http://schemas.microsoft.com/office/drawing/2016/5/12/chartex" xmlns:cx7="http://schemas.microsoft.com/office/drawing/2016/5/13/chartex" xmlns:cx8="http://schemas.microsoft.com/office/drawing/2016/5/14/chartex" xmlns:mc="http://schemas.openxmlformats.org/markup-compatibility/2006" xmlns:aink="http://schemas.microsoft.com/office/drawing/2016/ink" xmlns:am3d="http://schemas.microsoft.com/office/drawing/2017/model3d" xmlns:o="urn:schemas-microsoft-com:office:office" xmlns:oel="http://schemas.microsoft.com/office/2019/extlst" xmlns:r="http://schemas.openxmlformats.org/officeDocument/2006/relationships" xmlns:m="http://schemas.openxmlformats.org/officeDocument/2006/math" xmlns:v="urn:schemas-microsoft-com:vml" xmlns:wp14="http://schemas.microsoft.com/office/word/2010/wordprocessingDrawing" xmlns:wp="http://schemas.openxmlformats.org/drawingml/2006/wordprocessingDrawing" xmlns:w10="urn:schemas-microsoft-com:office:word" xmlns:w="http://schemas.openxmlformats.org/wordprocessingml/2006/main" xmlns:w14="http://schemas.microsoft.com/office/word/2010/wordml" xmlns:w15="http://schemas.microsoft.com/office/word/2012/wordml" xmlns:w16cex="http://schemas.microsoft.com/office/word/2018/wordml/cex" xmlns:w16cid="http://schemas.microsoft.com/office/word/2016/wordml/cid" xmlns:w16="http://schemas.microsoft.com/office/word/2018/wordml" xmlns:w16du="http://schemas.microsoft.com/office/word/2023/wordml/word16du" xmlns:w16sdtdh="http://schemas.microsoft.com/office/word/2020/wordml/sdtdatahash" xmlns:w16sdtfl="http://schemas.microsoft.com/office/word/2024/wordml/sdtformatlock" xmlns:w16se="http://schemas.microsoft.com/office/word/2015/wordml/symex" xmlns:wpg="http://schemas.microsoft.com/office/word/2010/wordprocessingGroup" xmlns:wpi="http://schemas.microsoft.com/office/word/2010/wordprocessingInk" xmlns:wne="http://schemas.microsoft.com/office/word/2006/wordml" xmlns:wps="http://schemas.microsoft.com/office/word/2010/wordprocessingShape" mc:Ignorable="w14 w15 w16se w16cid w16 w16cex w16sdtdh w16sdtfl w16du wp14">
+<w:hdr xmlns:wpc="http://schemas.microsoft.com/office/word/2010/wordprocessingCanvas" xmlns:cx="http://schemas.microsoft.com/office/drawing/2014/chartex" xmlns:mc="http://schemas.openxmlformats.org/markup-compatibility/2006" xmlns:o="urn:schemas-microsoft-com:office:office" xmlns:r="http://schemas.openxmlformats.org/officeDocument/2006/relationships" xmlns:m="http://schemas.openxmlformats.org/officeDocument/2006/math" xmlns:v="urn:schemas-microsoft-com:vml" xmlns:wp14="http://schemas.microsoft.com/office/word/2010/wordprocessingDrawing" xmlns:wp="http://schemas.openxmlformats.org/drawingml/2006/wordprocessingDrawing" xmlns:w10="urn:schemas-microsoft-com:office:word" xmlns:w="http://schemas.openxmlformats.org/wordprocessingml/2006/main" xmlns:w14="http://schemas.microsoft.com/office/word/2010/wordml" xmlns:w15="http://schemas.microsoft.com/office/word/2012/wordml" xmlns:w16se="http://schemas.microsoft.com/office/word/2015/wordml/symex" xmlns:wpg="http://schemas.microsoft.com/office/word/2010/wordprocessingGroup" xmlns:wpi="http://schemas.microsoft.com/office/word/2010/wordprocessingInk" xmlns:wne="http://schemas.microsoft.com/office/word/2006/wordml" xmlns:wps="http://schemas.microsoft.com/office/word/2010/wordprocessingShape" mc:Ignorable="w14 w15 w16se wp14">
   <w:p>
     <w:pPr>
       <w:pStyle w:val="Header"/>
@@ -2879,10 +3008,19 @@
     </w:pPr>
     <w:r>
       <w:rPr>
+        <w:i/>
         <w:sz w:val="24"/>
         <w:szCs w:val="24"/>
       </w:rPr>
-      <w:t>Báo cáo Đồ án &lt;Tên môn học&gt;</w:t>
+      <w:t xml:space="preserve">IE203 - </w:t>
+    </w:r>
+    <w:r>
+      <w:rPr>
+        <w:i/>
+        <w:sz w:val="24"/>
+        <w:szCs w:val="24"/>
+      </w:rPr>
+      <w:t>Hệ thống quản trị qui trình nghiệp vụ</w:t>
     </w:r>
     <w:r>
       <w:rPr>
@@ -2917,8 +3055,97 @@
 </file>
 
 <file path=word/numbering.xml><?xml version="1.0" encoding="utf-8"?>
-<w:numbering xmlns:wpc="http://schemas.microsoft.com/office/word/2010/wordprocessingCanvas" xmlns:cx="http://schemas.microsoft.com/office/drawing/2014/chartex" xmlns:cx1="http://schemas.microsoft.com/office/drawing/2015/9/8/chartex" xmlns:cx2="http://schemas.microsoft.com/office/drawing/2015/10/21/chartex" xmlns:cx3="http://schemas.microsoft.com/office/drawing/2016/5/9/chartex" xmlns:cx4="http://schemas.microsoft.com/office/drawing/2016/5/10/chartex" xmlns:cx5="http://schemas.microsoft.com/office/drawing/2016/5/11/chartex" xmlns:cx6="http://schemas.microsoft.com/office/drawing/2016/5/12/chartex" xmlns:cx7="http://schemas.microsoft.com/office/drawing/2016/5/13/chartex" xmlns:cx8="http://schemas.microsoft.com/office/drawing/2016/5/14/chartex" xmlns:mc="http://schemas.openxmlformats.org/markup-compatibility/2006" xmlns:aink="http://schemas.microsoft.com/office/drawing/2016/ink" xmlns:am3d="http://schemas.microsoft.com/office/drawing/2017/model3d" xmlns:o="urn:schemas-microsoft-com:office:office" xmlns:oel="http://schemas.microsoft.com/office/2019/extlst" xmlns:r="http://schemas.openxmlformats.org/officeDocument/2006/relationships" xmlns:m="http://schemas.openxmlformats.org/officeDocument/2006/math" xmlns:v="urn:schemas-microsoft-com:vml" xmlns:wp14="http://schemas.microsoft.com/office/word/2010/wordprocessingDrawing" xmlns:wp="http://schemas.openxmlformats.org/drawingml/2006/wordprocessingDrawing" xmlns:w10="urn:schemas-microsoft-com:office:word" xmlns:w="http://schemas.openxmlformats.org/wordprocessingml/2006/main" xmlns:w14="http://schemas.microsoft.com/office/word/2010/wordml" xmlns:w15="http://schemas.microsoft.com/office/word/2012/wordml" xmlns:w16cex="http://schemas.microsoft.com/office/word/2018/wordml/cex" xmlns:w16cid="http://schemas.microsoft.com/office/word/2016/wordml/cid" xmlns:w16="http://schemas.microsoft.com/office/word/2018/wordml" xmlns:w16du="http://schemas.microsoft.com/office/word/2023/wordml/word16du" xmlns:w16sdtdh="http://schemas.microsoft.com/office/word/2020/wordml/sdtdatahash" xmlns:w16sdtfl="http://schemas.microsoft.com/office/word/2024/wordml/sdtformatlock" xmlns:w16se="http://schemas.microsoft.com/office/word/2015/wordml/symex" xmlns:wpg="http://schemas.microsoft.com/office/word/2010/wordprocessingGroup" xmlns:wpi="http://schemas.microsoft.com/office/word/2010/wordprocessingInk" xmlns:wne="http://schemas.microsoft.com/office/word/2006/wordml" xmlns:wps="http://schemas.microsoft.com/office/word/2010/wordprocessingShape" mc:Ignorable="w14 w15 w16se w16cid w16 w16cex w16sdtdh w16sdtfl w16du wp14">
+<w:numbering xmlns:wpc="http://schemas.microsoft.com/office/word/2010/wordprocessingCanvas" xmlns:cx="http://schemas.microsoft.com/office/drawing/2014/chartex" xmlns:mc="http://schemas.openxmlformats.org/markup-compatibility/2006" xmlns:o="urn:schemas-microsoft-com:office:office" xmlns:r="http://schemas.openxmlformats.org/officeDocument/2006/relationships" xmlns:m="http://schemas.openxmlformats.org/officeDocument/2006/math" xmlns:v="urn:schemas-microsoft-com:vml" xmlns:wp14="http://schemas.microsoft.com/office/word/2010/wordprocessingDrawing" xmlns:wp="http://schemas.openxmlformats.org/drawingml/2006/wordprocessingDrawing" xmlns:w10="urn:schemas-microsoft-com:office:word" xmlns:w="http://schemas.openxmlformats.org/wordprocessingml/2006/main" xmlns:w14="http://schemas.microsoft.com/office/word/2010/wordml" xmlns:w15="http://schemas.microsoft.com/office/word/2012/wordml" xmlns:w16se="http://schemas.microsoft.com/office/word/2015/wordml/symex" xmlns:wpg="http://schemas.microsoft.com/office/word/2010/wordprocessingGroup" xmlns:wpi="http://schemas.microsoft.com/office/word/2010/wordprocessingInk" xmlns:wne="http://schemas.microsoft.com/office/word/2006/wordml" xmlns:wps="http://schemas.microsoft.com/office/word/2010/wordprocessingShape" mc:Ignorable="w14 w15 w16se wp14">
   <w:abstractNum w:abstractNumId="0" w15:restartNumberingAfterBreak="0">
+    <w:nsid w:val="0CA1247E"/>
+    <w:multiLevelType w:val="hybridMultilevel"/>
+    <w:tmpl w:val="737856F2"/>
+    <w:lvl w:ilvl="0" w:tplc="0409000F">
+      <w:start w:val="1"/>
+      <w:numFmt w:val="decimal"/>
+      <w:lvlText w:val="%1."/>
+      <w:lvlJc w:val="left"/>
+      <w:pPr>
+        <w:ind w:left="720" w:hanging="360"/>
+      </w:pPr>
+      <w:rPr>
+        <w:rFonts w:hint="default"/>
+      </w:rPr>
+    </w:lvl>
+    <w:lvl w:ilvl="1" w:tplc="04090019" w:tentative="1">
+      <w:start w:val="1"/>
+      <w:numFmt w:val="lowerLetter"/>
+      <w:lvlText w:val="%2."/>
+      <w:lvlJc w:val="left"/>
+      <w:pPr>
+        <w:ind w:left="1440" w:hanging="360"/>
+      </w:pPr>
+    </w:lvl>
+    <w:lvl w:ilvl="2" w:tplc="0409001B" w:tentative="1">
+      <w:start w:val="1"/>
+      <w:numFmt w:val="lowerRoman"/>
+      <w:lvlText w:val="%3."/>
+      <w:lvlJc w:val="right"/>
+      <w:pPr>
+        <w:ind w:left="2160" w:hanging="180"/>
+      </w:pPr>
+    </w:lvl>
+    <w:lvl w:ilvl="3" w:tplc="0409000F" w:tentative="1">
+      <w:start w:val="1"/>
+      <w:numFmt w:val="decimal"/>
+      <w:lvlText w:val="%4."/>
+      <w:lvlJc w:val="left"/>
+      <w:pPr>
+        <w:ind w:left="2880" w:hanging="360"/>
+      </w:pPr>
+    </w:lvl>
+    <w:lvl w:ilvl="4" w:tplc="04090019" w:tentative="1">
+      <w:start w:val="1"/>
+      <w:numFmt w:val="lowerLetter"/>
+      <w:lvlText w:val="%5."/>
+      <w:lvlJc w:val="left"/>
+      <w:pPr>
+        <w:ind w:left="3600" w:hanging="360"/>
+      </w:pPr>
+    </w:lvl>
+    <w:lvl w:ilvl="5" w:tplc="0409001B" w:tentative="1">
+      <w:start w:val="1"/>
+      <w:numFmt w:val="lowerRoman"/>
+      <w:lvlText w:val="%6."/>
+      <w:lvlJc w:val="right"/>
+      <w:pPr>
+        <w:ind w:left="4320" w:hanging="180"/>
+      </w:pPr>
+    </w:lvl>
+    <w:lvl w:ilvl="6" w:tplc="0409000F" w:tentative="1">
+      <w:start w:val="1"/>
+      <w:numFmt w:val="decimal"/>
+      <w:lvlText w:val="%7."/>
+      <w:lvlJc w:val="left"/>
+      <w:pPr>
+        <w:ind w:left="5040" w:hanging="360"/>
+      </w:pPr>
+    </w:lvl>
+    <w:lvl w:ilvl="7" w:tplc="04090019" w:tentative="1">
+      <w:start w:val="1"/>
+      <w:numFmt w:val="lowerLetter"/>
+      <w:lvlText w:val="%8."/>
+      <w:lvlJc w:val="left"/>
+      <w:pPr>
+        <w:ind w:left="5760" w:hanging="360"/>
+      </w:pPr>
+    </w:lvl>
+    <w:lvl w:ilvl="8" w:tplc="0409001B" w:tentative="1">
+      <w:start w:val="1"/>
+      <w:numFmt w:val="lowerRoman"/>
+      <w:lvlText w:val="%9."/>
+      <w:lvlJc w:val="right"/>
+      <w:pPr>
+        <w:ind w:left="6480" w:hanging="180"/>
+      </w:pPr>
+    </w:lvl>
+  </w:abstractNum>
+  <w:abstractNum w:abstractNumId="1" w15:restartNumberingAfterBreak="0">
     <w:nsid w:val="17734325"/>
     <w:multiLevelType w:val="hybridMultilevel"/>
     <w:tmpl w:val="1FD45FEA"/>
@@ -3007,7 +3234,459 @@
       </w:pPr>
     </w:lvl>
   </w:abstractNum>
-  <w:abstractNum w:abstractNumId="1" w15:restartNumberingAfterBreak="0">
+  <w:abstractNum w:abstractNumId="2" w15:restartNumberingAfterBreak="0">
+    <w:nsid w:val="23EF4721"/>
+    <w:multiLevelType w:val="hybridMultilevel"/>
+    <w:tmpl w:val="F968BD98"/>
+    <w:lvl w:ilvl="0" w:tplc="04090001">
+      <w:start w:val="1"/>
+      <w:numFmt w:val="bullet"/>
+      <w:lvlText w:val=""/>
+      <w:lvlJc w:val="left"/>
+      <w:pPr>
+        <w:ind w:left="720" w:hanging="360"/>
+      </w:pPr>
+      <w:rPr>
+        <w:rFonts w:ascii="Symbol" w:hAnsi="Symbol" w:hint="default"/>
+      </w:rPr>
+    </w:lvl>
+    <w:lvl w:ilvl="1" w:tplc="04090003" w:tentative="1">
+      <w:start w:val="1"/>
+      <w:numFmt w:val="bullet"/>
+      <w:lvlText w:val="o"/>
+      <w:lvlJc w:val="left"/>
+      <w:pPr>
+        <w:ind w:left="1440" w:hanging="360"/>
+      </w:pPr>
+      <w:rPr>
+        <w:rFonts w:ascii="Courier New" w:hAnsi="Courier New" w:cs="Courier New" w:hint="default"/>
+      </w:rPr>
+    </w:lvl>
+    <w:lvl w:ilvl="2" w:tplc="04090005" w:tentative="1">
+      <w:start w:val="1"/>
+      <w:numFmt w:val="bullet"/>
+      <w:lvlText w:val=""/>
+      <w:lvlJc w:val="left"/>
+      <w:pPr>
+        <w:ind w:left="2160" w:hanging="360"/>
+      </w:pPr>
+      <w:rPr>
+        <w:rFonts w:ascii="Wingdings" w:hAnsi="Wingdings" w:hint="default"/>
+      </w:rPr>
+    </w:lvl>
+    <w:lvl w:ilvl="3" w:tplc="04090001" w:tentative="1">
+      <w:start w:val="1"/>
+      <w:numFmt w:val="bullet"/>
+      <w:lvlText w:val=""/>
+      <w:lvlJc w:val="left"/>
+      <w:pPr>
+        <w:ind w:left="2880" w:hanging="360"/>
+      </w:pPr>
+      <w:rPr>
+        <w:rFonts w:ascii="Symbol" w:hAnsi="Symbol" w:hint="default"/>
+      </w:rPr>
+    </w:lvl>
+    <w:lvl w:ilvl="4" w:tplc="04090003" w:tentative="1">
+      <w:start w:val="1"/>
+      <w:numFmt w:val="bullet"/>
+      <w:lvlText w:val="o"/>
+      <w:lvlJc w:val="left"/>
+      <w:pPr>
+        <w:ind w:left="3600" w:hanging="360"/>
+      </w:pPr>
+      <w:rPr>
+        <w:rFonts w:ascii="Courier New" w:hAnsi="Courier New" w:cs="Courier New" w:hint="default"/>
+      </w:rPr>
+    </w:lvl>
+    <w:lvl w:ilvl="5" w:tplc="04090005" w:tentative="1">
+      <w:start w:val="1"/>
+      <w:numFmt w:val="bullet"/>
+      <w:lvlText w:val=""/>
+      <w:lvlJc w:val="left"/>
+      <w:pPr>
+        <w:ind w:left="4320" w:hanging="360"/>
+      </w:pPr>
+      <w:rPr>
+        <w:rFonts w:ascii="Wingdings" w:hAnsi="Wingdings" w:hint="default"/>
+      </w:rPr>
+    </w:lvl>
+    <w:lvl w:ilvl="6" w:tplc="04090001" w:tentative="1">
+      <w:start w:val="1"/>
+      <w:numFmt w:val="bullet"/>
+      <w:lvlText w:val=""/>
+      <w:lvlJc w:val="left"/>
+      <w:pPr>
+        <w:ind w:left="5040" w:hanging="360"/>
+      </w:pPr>
+      <w:rPr>
+        <w:rFonts w:ascii="Symbol" w:hAnsi="Symbol" w:hint="default"/>
+      </w:rPr>
+    </w:lvl>
+    <w:lvl w:ilvl="7" w:tplc="04090003" w:tentative="1">
+      <w:start w:val="1"/>
+      <w:numFmt w:val="bullet"/>
+      <w:lvlText w:val="o"/>
+      <w:lvlJc w:val="left"/>
+      <w:pPr>
+        <w:ind w:left="5760" w:hanging="360"/>
+      </w:pPr>
+      <w:rPr>
+        <w:rFonts w:ascii="Courier New" w:hAnsi="Courier New" w:cs="Courier New" w:hint="default"/>
+      </w:rPr>
+    </w:lvl>
+    <w:lvl w:ilvl="8" w:tplc="04090005" w:tentative="1">
+      <w:start w:val="1"/>
+      <w:numFmt w:val="bullet"/>
+      <w:lvlText w:val=""/>
+      <w:lvlJc w:val="left"/>
+      <w:pPr>
+        <w:ind w:left="6480" w:hanging="360"/>
+      </w:pPr>
+      <w:rPr>
+        <w:rFonts w:ascii="Wingdings" w:hAnsi="Wingdings" w:hint="default"/>
+      </w:rPr>
+    </w:lvl>
+  </w:abstractNum>
+  <w:abstractNum w:abstractNumId="3" w15:restartNumberingAfterBreak="0">
+    <w:nsid w:val="3BB84C08"/>
+    <w:multiLevelType w:val="multilevel"/>
+    <w:tmpl w:val="15EA2E82"/>
+    <w:lvl w:ilvl="0">
+      <w:start w:val="1"/>
+      <w:numFmt w:val="decimal"/>
+      <w:lvlText w:val="%1"/>
+      <w:lvlJc w:val="left"/>
+      <w:pPr>
+        <w:ind w:left="360" w:hanging="360"/>
+      </w:pPr>
+      <w:rPr>
+        <w:rFonts w:hint="default"/>
+      </w:rPr>
+    </w:lvl>
+    <w:lvl w:ilvl="1">
+      <w:start w:val="3"/>
+      <w:numFmt w:val="decimal"/>
+      <w:lvlText w:val="%1.%2"/>
+      <w:lvlJc w:val="left"/>
+      <w:pPr>
+        <w:ind w:left="360" w:hanging="360"/>
+      </w:pPr>
+      <w:rPr>
+        <w:rFonts w:hint="default"/>
+      </w:rPr>
+    </w:lvl>
+    <w:lvl w:ilvl="2">
+      <w:start w:val="1"/>
+      <w:numFmt w:val="decimal"/>
+      <w:lvlText w:val="%1.%2.%3"/>
+      <w:lvlJc w:val="left"/>
+      <w:pPr>
+        <w:ind w:left="720" w:hanging="720"/>
+      </w:pPr>
+      <w:rPr>
+        <w:rFonts w:hint="default"/>
+      </w:rPr>
+    </w:lvl>
+    <w:lvl w:ilvl="3">
+      <w:start w:val="1"/>
+      <w:numFmt w:val="decimal"/>
+      <w:lvlText w:val="%1.%2.%3.%4"/>
+      <w:lvlJc w:val="left"/>
+      <w:pPr>
+        <w:ind w:left="720" w:hanging="720"/>
+      </w:pPr>
+      <w:rPr>
+        <w:rFonts w:hint="default"/>
+      </w:rPr>
+    </w:lvl>
+    <w:lvl w:ilvl="4">
+      <w:start w:val="1"/>
+      <w:numFmt w:val="decimal"/>
+      <w:lvlText w:val="%1.%2.%3.%4.%5"/>
+      <w:lvlJc w:val="left"/>
+      <w:pPr>
+        <w:ind w:left="1080" w:hanging="1080"/>
+      </w:pPr>
+      <w:rPr>
+        <w:rFonts w:hint="default"/>
+      </w:rPr>
+    </w:lvl>
+    <w:lvl w:ilvl="5">
+      <w:start w:val="1"/>
+      <w:numFmt w:val="decimal"/>
+      <w:lvlText w:val="%1.%2.%3.%4.%5.%6"/>
+      <w:lvlJc w:val="left"/>
+      <w:pPr>
+        <w:ind w:left="1440" w:hanging="1440"/>
+      </w:pPr>
+      <w:rPr>
+        <w:rFonts w:hint="default"/>
+      </w:rPr>
+    </w:lvl>
+    <w:lvl w:ilvl="6">
+      <w:start w:val="1"/>
+      <w:numFmt w:val="decimal"/>
+      <w:lvlText w:val="%1.%2.%3.%4.%5.%6.%7"/>
+      <w:lvlJc w:val="left"/>
+      <w:pPr>
+        <w:ind w:left="1440" w:hanging="1440"/>
+      </w:pPr>
+      <w:rPr>
+        <w:rFonts w:hint="default"/>
+      </w:rPr>
+    </w:lvl>
+    <w:lvl w:ilvl="7">
+      <w:start w:val="1"/>
+      <w:numFmt w:val="decimal"/>
+      <w:lvlText w:val="%1.%2.%3.%4.%5.%6.%7.%8"/>
+      <w:lvlJc w:val="left"/>
+      <w:pPr>
+        <w:ind w:left="1800" w:hanging="1800"/>
+      </w:pPr>
+      <w:rPr>
+        <w:rFonts w:hint="default"/>
+      </w:rPr>
+    </w:lvl>
+    <w:lvl w:ilvl="8">
+      <w:start w:val="1"/>
+      <w:numFmt w:val="decimal"/>
+      <w:lvlText w:val="%1.%2.%3.%4.%5.%6.%7.%8.%9"/>
+      <w:lvlJc w:val="left"/>
+      <w:pPr>
+        <w:ind w:left="1800" w:hanging="1800"/>
+      </w:pPr>
+      <w:rPr>
+        <w:rFonts w:hint="default"/>
+      </w:rPr>
+    </w:lvl>
+  </w:abstractNum>
+  <w:abstractNum w:abstractNumId="4" w15:restartNumberingAfterBreak="0">
+    <w:nsid w:val="40AE21F6"/>
+    <w:multiLevelType w:val="hybridMultilevel"/>
+    <w:tmpl w:val="21A076AA"/>
+    <w:lvl w:ilvl="0" w:tplc="B70AB280">
+      <w:start w:val="1"/>
+      <w:numFmt w:val="bullet"/>
+      <w:lvlText w:val=""/>
+      <w:lvlJc w:val="left"/>
+      <w:pPr>
+        <w:ind w:left="720" w:hanging="360"/>
+      </w:pPr>
+      <w:rPr>
+        <w:rFonts w:ascii="Symbol" w:hAnsi="Symbol" w:hint="default"/>
+      </w:rPr>
+    </w:lvl>
+    <w:lvl w:ilvl="1" w:tplc="04090003" w:tentative="1">
+      <w:start w:val="1"/>
+      <w:numFmt w:val="bullet"/>
+      <w:lvlText w:val="o"/>
+      <w:lvlJc w:val="left"/>
+      <w:pPr>
+        <w:ind w:left="1440" w:hanging="360"/>
+      </w:pPr>
+      <w:rPr>
+        <w:rFonts w:ascii="Courier New" w:hAnsi="Courier New" w:cs="Courier New" w:hint="default"/>
+      </w:rPr>
+    </w:lvl>
+    <w:lvl w:ilvl="2" w:tplc="04090005" w:tentative="1">
+      <w:start w:val="1"/>
+      <w:numFmt w:val="bullet"/>
+      <w:lvlText w:val=""/>
+      <w:lvlJc w:val="left"/>
+      <w:pPr>
+        <w:ind w:left="2160" w:hanging="360"/>
+      </w:pPr>
+      <w:rPr>
+        <w:rFonts w:ascii="Wingdings" w:hAnsi="Wingdings" w:hint="default"/>
+      </w:rPr>
+    </w:lvl>
+    <w:lvl w:ilvl="3" w:tplc="04090001" w:tentative="1">
+      <w:start w:val="1"/>
+      <w:numFmt w:val="bullet"/>
+      <w:lvlText w:val=""/>
+      <w:lvlJc w:val="left"/>
+      <w:pPr>
+        <w:ind w:left="2880" w:hanging="360"/>
+      </w:pPr>
+      <w:rPr>
+        <w:rFonts w:ascii="Symbol" w:hAnsi="Symbol" w:hint="default"/>
+      </w:rPr>
+    </w:lvl>
+    <w:lvl w:ilvl="4" w:tplc="04090003" w:tentative="1">
+      <w:start w:val="1"/>
+      <w:numFmt w:val="bullet"/>
+      <w:lvlText w:val="o"/>
+      <w:lvlJc w:val="left"/>
+      <w:pPr>
+        <w:ind w:left="3600" w:hanging="360"/>
+      </w:pPr>
+      <w:rPr>
+        <w:rFonts w:ascii="Courier New" w:hAnsi="Courier New" w:cs="Courier New" w:hint="default"/>
+      </w:rPr>
+    </w:lvl>
+    <w:lvl w:ilvl="5" w:tplc="04090005" w:tentative="1">
+      <w:start w:val="1"/>
+      <w:numFmt w:val="bullet"/>
+      <w:lvlText w:val=""/>
+      <w:lvlJc w:val="left"/>
+      <w:pPr>
+        <w:ind w:left="4320" w:hanging="360"/>
+      </w:pPr>
+      <w:rPr>
+        <w:rFonts w:ascii="Wingdings" w:hAnsi="Wingdings" w:hint="default"/>
+      </w:rPr>
+    </w:lvl>
+    <w:lvl w:ilvl="6" w:tplc="04090001" w:tentative="1">
+      <w:start w:val="1"/>
+      <w:numFmt w:val="bullet"/>
+      <w:lvlText w:val=""/>
+      <w:lvlJc w:val="left"/>
+      <w:pPr>
+        <w:ind w:left="5040" w:hanging="360"/>
+      </w:pPr>
+      <w:rPr>
+        <w:rFonts w:ascii="Symbol" w:hAnsi="Symbol" w:hint="default"/>
+      </w:rPr>
+    </w:lvl>
+    <w:lvl w:ilvl="7" w:tplc="04090003" w:tentative="1">
+      <w:start w:val="1"/>
+      <w:numFmt w:val="bullet"/>
+      <w:lvlText w:val="o"/>
+      <w:lvlJc w:val="left"/>
+      <w:pPr>
+        <w:ind w:left="5760" w:hanging="360"/>
+      </w:pPr>
+      <w:rPr>
+        <w:rFonts w:ascii="Courier New" w:hAnsi="Courier New" w:cs="Courier New" w:hint="default"/>
+      </w:rPr>
+    </w:lvl>
+    <w:lvl w:ilvl="8" w:tplc="04090005" w:tentative="1">
+      <w:start w:val="1"/>
+      <w:numFmt w:val="bullet"/>
+      <w:lvlText w:val=""/>
+      <w:lvlJc w:val="left"/>
+      <w:pPr>
+        <w:ind w:left="6480" w:hanging="360"/>
+      </w:pPr>
+      <w:rPr>
+        <w:rFonts w:ascii="Wingdings" w:hAnsi="Wingdings" w:hint="default"/>
+      </w:rPr>
+    </w:lvl>
+  </w:abstractNum>
+  <w:abstractNum w:abstractNumId="5" w15:restartNumberingAfterBreak="0">
+    <w:nsid w:val="40B811FD"/>
+    <w:multiLevelType w:val="hybridMultilevel"/>
+    <w:tmpl w:val="A5DC8B7C"/>
+    <w:lvl w:ilvl="0" w:tplc="04090001">
+      <w:start w:val="1"/>
+      <w:numFmt w:val="bullet"/>
+      <w:lvlText w:val=""/>
+      <w:lvlJc w:val="left"/>
+      <w:pPr>
+        <w:ind w:left="720" w:hanging="360"/>
+      </w:pPr>
+      <w:rPr>
+        <w:rFonts w:ascii="Symbol" w:hAnsi="Symbol" w:hint="default"/>
+      </w:rPr>
+    </w:lvl>
+    <w:lvl w:ilvl="1" w:tplc="04090003" w:tentative="1">
+      <w:start w:val="1"/>
+      <w:numFmt w:val="bullet"/>
+      <w:lvlText w:val="o"/>
+      <w:lvlJc w:val="left"/>
+      <w:pPr>
+        <w:ind w:left="1440" w:hanging="360"/>
+      </w:pPr>
+      <w:rPr>
+        <w:rFonts w:ascii="Courier New" w:hAnsi="Courier New" w:cs="Courier New" w:hint="default"/>
+      </w:rPr>
+    </w:lvl>
+    <w:lvl w:ilvl="2" w:tplc="04090005" w:tentative="1">
+      <w:start w:val="1"/>
+      <w:numFmt w:val="bullet"/>
+      <w:lvlText w:val=""/>
+      <w:lvlJc w:val="left"/>
+      <w:pPr>
+        <w:ind w:left="2160" w:hanging="360"/>
+      </w:pPr>
+      <w:rPr>
+        <w:rFonts w:ascii="Wingdings" w:hAnsi="Wingdings" w:hint="default"/>
+      </w:rPr>
+    </w:lvl>
+    <w:lvl w:ilvl="3" w:tplc="04090001" w:tentative="1">
+      <w:start w:val="1"/>
+      <w:numFmt w:val="bullet"/>
+      <w:lvlText w:val=""/>
+      <w:lvlJc w:val="left"/>
+      <w:pPr>
+        <w:ind w:left="2880" w:hanging="360"/>
+      </w:pPr>
+      <w:rPr>
+        <w:rFonts w:ascii="Symbol" w:hAnsi="Symbol" w:hint="default"/>
+      </w:rPr>
+    </w:lvl>
+    <w:lvl w:ilvl="4" w:tplc="04090003" w:tentative="1">
+      <w:start w:val="1"/>
+      <w:numFmt w:val="bullet"/>
+      <w:lvlText w:val="o"/>
+      <w:lvlJc w:val="left"/>
+      <w:pPr>
+        <w:ind w:left="3600" w:hanging="360"/>
+      </w:pPr>
+      <w:rPr>
+        <w:rFonts w:ascii="Courier New" w:hAnsi="Courier New" w:cs="Courier New" w:hint="default"/>
+      </w:rPr>
+    </w:lvl>
+    <w:lvl w:ilvl="5" w:tplc="04090005" w:tentative="1">
+      <w:start w:val="1"/>
+      <w:numFmt w:val="bullet"/>
+      <w:lvlText w:val=""/>
+      <w:lvlJc w:val="left"/>
+      <w:pPr>
+        <w:ind w:left="4320" w:hanging="360"/>
+      </w:pPr>
+      <w:rPr>
+        <w:rFonts w:ascii="Wingdings" w:hAnsi="Wingdings" w:hint="default"/>
+      </w:rPr>
+    </w:lvl>
+    <w:lvl w:ilvl="6" w:tplc="04090001" w:tentative="1">
+      <w:start w:val="1"/>
+      <w:numFmt w:val="bullet"/>
+      <w:lvlText w:val=""/>
+      <w:lvlJc w:val="left"/>
+      <w:pPr>
+        <w:ind w:left="5040" w:hanging="360"/>
+      </w:pPr>
+      <w:rPr>
+        <w:rFonts w:ascii="Symbol" w:hAnsi="Symbol" w:hint="default"/>
+      </w:rPr>
+    </w:lvl>
+    <w:lvl w:ilvl="7" w:tplc="04090003" w:tentative="1">
+      <w:start w:val="1"/>
+      <w:numFmt w:val="bullet"/>
+      <w:lvlText w:val="o"/>
+      <w:lvlJc w:val="left"/>
+      <w:pPr>
+        <w:ind w:left="5760" w:hanging="360"/>
+      </w:pPr>
+      <w:rPr>
+        <w:rFonts w:ascii="Courier New" w:hAnsi="Courier New" w:cs="Courier New" w:hint="default"/>
+      </w:rPr>
+    </w:lvl>
+    <w:lvl w:ilvl="8" w:tplc="04090005" w:tentative="1">
+      <w:start w:val="1"/>
+      <w:numFmt w:val="bullet"/>
+      <w:lvlText w:val=""/>
+      <w:lvlJc w:val="left"/>
+      <w:pPr>
+        <w:ind w:left="6480" w:hanging="360"/>
+      </w:pPr>
+      <w:rPr>
+        <w:rFonts w:ascii="Wingdings" w:hAnsi="Wingdings" w:hint="default"/>
+      </w:rPr>
+    </w:lvl>
+  </w:abstractNum>
+  <w:abstractNum w:abstractNumId="6" w15:restartNumberingAfterBreak="0">
     <w:nsid w:val="40D8608A"/>
     <w:multiLevelType w:val="hybridMultilevel"/>
     <w:tmpl w:val="979CD868"/>
@@ -3096,7 +3775,7 @@
       </w:pPr>
     </w:lvl>
   </w:abstractNum>
-  <w:abstractNum w:abstractNumId="2" w15:restartNumberingAfterBreak="0">
+  <w:abstractNum w:abstractNumId="7" w15:restartNumberingAfterBreak="0">
     <w:nsid w:val="46A44212"/>
     <w:multiLevelType w:val="hybridMultilevel"/>
     <w:tmpl w:val="B42A62EC"/>
@@ -3208,7 +3887,7 @@
       </w:rPr>
     </w:lvl>
   </w:abstractNum>
-  <w:abstractNum w:abstractNumId="3" w15:restartNumberingAfterBreak="0">
+  <w:abstractNum w:abstractNumId="8" w15:restartNumberingAfterBreak="0">
     <w:nsid w:val="46EB5F37"/>
     <w:multiLevelType w:val="hybridMultilevel"/>
     <w:tmpl w:val="FC529674"/>
@@ -3294,7 +3973,322 @@
       </w:pPr>
     </w:lvl>
   </w:abstractNum>
-  <w:abstractNum w:abstractNumId="4" w15:restartNumberingAfterBreak="0">
+  <w:abstractNum w:abstractNumId="9" w15:restartNumberingAfterBreak="0">
+    <w:nsid w:val="55526E7B"/>
+    <w:multiLevelType w:val="hybridMultilevel"/>
+    <w:tmpl w:val="F828AA00"/>
+    <w:lvl w:ilvl="0" w:tplc="0409000F">
+      <w:start w:val="1"/>
+      <w:numFmt w:val="decimal"/>
+      <w:lvlText w:val="%1."/>
+      <w:lvlJc w:val="left"/>
+      <w:pPr>
+        <w:ind w:left="720" w:hanging="360"/>
+      </w:pPr>
+      <w:rPr>
+        <w:rFonts w:hint="default"/>
+      </w:rPr>
+    </w:lvl>
+    <w:lvl w:ilvl="1" w:tplc="04090019" w:tentative="1">
+      <w:start w:val="1"/>
+      <w:numFmt w:val="lowerLetter"/>
+      <w:lvlText w:val="%2."/>
+      <w:lvlJc w:val="left"/>
+      <w:pPr>
+        <w:ind w:left="1440" w:hanging="360"/>
+      </w:pPr>
+    </w:lvl>
+    <w:lvl w:ilvl="2" w:tplc="0409001B" w:tentative="1">
+      <w:start w:val="1"/>
+      <w:numFmt w:val="lowerRoman"/>
+      <w:lvlText w:val="%3."/>
+      <w:lvlJc w:val="right"/>
+      <w:pPr>
+        <w:ind w:left="2160" w:hanging="180"/>
+      </w:pPr>
+    </w:lvl>
+    <w:lvl w:ilvl="3" w:tplc="0409000F" w:tentative="1">
+      <w:start w:val="1"/>
+      <w:numFmt w:val="decimal"/>
+      <w:lvlText w:val="%4."/>
+      <w:lvlJc w:val="left"/>
+      <w:pPr>
+        <w:ind w:left="2880" w:hanging="360"/>
+      </w:pPr>
+    </w:lvl>
+    <w:lvl w:ilvl="4" w:tplc="04090019" w:tentative="1">
+      <w:start w:val="1"/>
+      <w:numFmt w:val="lowerLetter"/>
+      <w:lvlText w:val="%5."/>
+      <w:lvlJc w:val="left"/>
+      <w:pPr>
+        <w:ind w:left="3600" w:hanging="360"/>
+      </w:pPr>
+    </w:lvl>
+    <w:lvl w:ilvl="5" w:tplc="0409001B" w:tentative="1">
+      <w:start w:val="1"/>
+      <w:numFmt w:val="lowerRoman"/>
+      <w:lvlText w:val="%6."/>
+      <w:lvlJc w:val="right"/>
+      <w:pPr>
+        <w:ind w:left="4320" w:hanging="180"/>
+      </w:pPr>
+    </w:lvl>
+    <w:lvl w:ilvl="6" w:tplc="0409000F" w:tentative="1">
+      <w:start w:val="1"/>
+      <w:numFmt w:val="decimal"/>
+      <w:lvlText w:val="%7."/>
+      <w:lvlJc w:val="left"/>
+      <w:pPr>
+        <w:ind w:left="5040" w:hanging="360"/>
+      </w:pPr>
+    </w:lvl>
+    <w:lvl w:ilvl="7" w:tplc="04090019" w:tentative="1">
+      <w:start w:val="1"/>
+      <w:numFmt w:val="lowerLetter"/>
+      <w:lvlText w:val="%8."/>
+      <w:lvlJc w:val="left"/>
+      <w:pPr>
+        <w:ind w:left="5760" w:hanging="360"/>
+      </w:pPr>
+    </w:lvl>
+    <w:lvl w:ilvl="8" w:tplc="0409001B" w:tentative="1">
+      <w:start w:val="1"/>
+      <w:numFmt w:val="lowerRoman"/>
+      <w:lvlText w:val="%9."/>
+      <w:lvlJc w:val="right"/>
+      <w:pPr>
+        <w:ind w:left="6480" w:hanging="180"/>
+      </w:pPr>
+    </w:lvl>
+  </w:abstractNum>
+  <w:abstractNum w:abstractNumId="10" w15:restartNumberingAfterBreak="0">
+    <w:nsid w:val="5555769C"/>
+    <w:multiLevelType w:val="hybridMultilevel"/>
+    <w:tmpl w:val="1EE6DECC"/>
+    <w:lvl w:ilvl="0" w:tplc="04090009">
+      <w:start w:val="1"/>
+      <w:numFmt w:val="bullet"/>
+      <w:lvlText w:val=""/>
+      <w:lvlJc w:val="left"/>
+      <w:pPr>
+        <w:ind w:left="1440" w:hanging="360"/>
+      </w:pPr>
+      <w:rPr>
+        <w:rFonts w:ascii="Wingdings" w:hAnsi="Wingdings" w:hint="default"/>
+      </w:rPr>
+    </w:lvl>
+    <w:lvl w:ilvl="1" w:tplc="04090003" w:tentative="1">
+      <w:start w:val="1"/>
+      <w:numFmt w:val="bullet"/>
+      <w:lvlText w:val="o"/>
+      <w:lvlJc w:val="left"/>
+      <w:pPr>
+        <w:ind w:left="2160" w:hanging="360"/>
+      </w:pPr>
+      <w:rPr>
+        <w:rFonts w:ascii="Courier New" w:hAnsi="Courier New" w:cs="Courier New" w:hint="default"/>
+      </w:rPr>
+    </w:lvl>
+    <w:lvl w:ilvl="2" w:tplc="04090005" w:tentative="1">
+      <w:start w:val="1"/>
+      <w:numFmt w:val="bullet"/>
+      <w:lvlText w:val=""/>
+      <w:lvlJc w:val="left"/>
+      <w:pPr>
+        <w:ind w:left="2880" w:hanging="360"/>
+      </w:pPr>
+      <w:rPr>
+        <w:rFonts w:ascii="Wingdings" w:hAnsi="Wingdings" w:hint="default"/>
+      </w:rPr>
+    </w:lvl>
+    <w:lvl w:ilvl="3" w:tplc="04090001" w:tentative="1">
+      <w:start w:val="1"/>
+      <w:numFmt w:val="bullet"/>
+      <w:lvlText w:val=""/>
+      <w:lvlJc w:val="left"/>
+      <w:pPr>
+        <w:ind w:left="3600" w:hanging="360"/>
+      </w:pPr>
+      <w:rPr>
+        <w:rFonts w:ascii="Symbol" w:hAnsi="Symbol" w:hint="default"/>
+      </w:rPr>
+    </w:lvl>
+    <w:lvl w:ilvl="4" w:tplc="04090003" w:tentative="1">
+      <w:start w:val="1"/>
+      <w:numFmt w:val="bullet"/>
+      <w:lvlText w:val="o"/>
+      <w:lvlJc w:val="left"/>
+      <w:pPr>
+        <w:ind w:left="4320" w:hanging="360"/>
+      </w:pPr>
+      <w:rPr>
+        <w:rFonts w:ascii="Courier New" w:hAnsi="Courier New" w:cs="Courier New" w:hint="default"/>
+      </w:rPr>
+    </w:lvl>
+    <w:lvl w:ilvl="5" w:tplc="04090005" w:tentative="1">
+      <w:start w:val="1"/>
+      <w:numFmt w:val="bullet"/>
+      <w:lvlText w:val=""/>
+      <w:lvlJc w:val="left"/>
+      <w:pPr>
+        <w:ind w:left="5040" w:hanging="360"/>
+      </w:pPr>
+      <w:rPr>
+        <w:rFonts w:ascii="Wingdings" w:hAnsi="Wingdings" w:hint="default"/>
+      </w:rPr>
+    </w:lvl>
+    <w:lvl w:ilvl="6" w:tplc="04090001" w:tentative="1">
+      <w:start w:val="1"/>
+      <w:numFmt w:val="bullet"/>
+      <w:lvlText w:val=""/>
+      <w:lvlJc w:val="left"/>
+      <w:pPr>
+        <w:ind w:left="5760" w:hanging="360"/>
+      </w:pPr>
+      <w:rPr>
+        <w:rFonts w:ascii="Symbol" w:hAnsi="Symbol" w:hint="default"/>
+      </w:rPr>
+    </w:lvl>
+    <w:lvl w:ilvl="7" w:tplc="04090003" w:tentative="1">
+      <w:start w:val="1"/>
+      <w:numFmt w:val="bullet"/>
+      <w:lvlText w:val="o"/>
+      <w:lvlJc w:val="left"/>
+      <w:pPr>
+        <w:ind w:left="6480" w:hanging="360"/>
+      </w:pPr>
+      <w:rPr>
+        <w:rFonts w:ascii="Courier New" w:hAnsi="Courier New" w:cs="Courier New" w:hint="default"/>
+      </w:rPr>
+    </w:lvl>
+    <w:lvl w:ilvl="8" w:tplc="04090005" w:tentative="1">
+      <w:start w:val="1"/>
+      <w:numFmt w:val="bullet"/>
+      <w:lvlText w:val=""/>
+      <w:lvlJc w:val="left"/>
+      <w:pPr>
+        <w:ind w:left="7200" w:hanging="360"/>
+      </w:pPr>
+      <w:rPr>
+        <w:rFonts w:ascii="Wingdings" w:hAnsi="Wingdings" w:hint="default"/>
+      </w:rPr>
+    </w:lvl>
+  </w:abstractNum>
+  <w:abstractNum w:abstractNumId="11" w15:restartNumberingAfterBreak="0">
+    <w:nsid w:val="62505955"/>
+    <w:multiLevelType w:val="hybridMultilevel"/>
+    <w:tmpl w:val="E02ED160"/>
+    <w:lvl w:ilvl="0" w:tplc="0409000B">
+      <w:start w:val="1"/>
+      <w:numFmt w:val="bullet"/>
+      <w:lvlText w:val=""/>
+      <w:lvlJc w:val="left"/>
+      <w:pPr>
+        <w:ind w:left="720" w:hanging="360"/>
+      </w:pPr>
+      <w:rPr>
+        <w:rFonts w:ascii="Wingdings" w:hAnsi="Wingdings" w:hint="default"/>
+      </w:rPr>
+    </w:lvl>
+    <w:lvl w:ilvl="1" w:tplc="04090003" w:tentative="1">
+      <w:start w:val="1"/>
+      <w:numFmt w:val="bullet"/>
+      <w:lvlText w:val="o"/>
+      <w:lvlJc w:val="left"/>
+      <w:pPr>
+        <w:ind w:left="1440" w:hanging="360"/>
+      </w:pPr>
+      <w:rPr>
+        <w:rFonts w:ascii="Courier New" w:hAnsi="Courier New" w:cs="Courier New" w:hint="default"/>
+      </w:rPr>
+    </w:lvl>
+    <w:lvl w:ilvl="2" w:tplc="04090005" w:tentative="1">
+      <w:start w:val="1"/>
+      <w:numFmt w:val="bullet"/>
+      <w:lvlText w:val=""/>
+      <w:lvlJc w:val="left"/>
+      <w:pPr>
+        <w:ind w:left="2160" w:hanging="360"/>
+      </w:pPr>
+      <w:rPr>
+        <w:rFonts w:ascii="Wingdings" w:hAnsi="Wingdings" w:hint="default"/>
+      </w:rPr>
+    </w:lvl>
+    <w:lvl w:ilvl="3" w:tplc="04090001" w:tentative="1">
+      <w:start w:val="1"/>
+      <w:numFmt w:val="bullet"/>
+      <w:lvlText w:val=""/>
+      <w:lvlJc w:val="left"/>
+      <w:pPr>
+        <w:ind w:left="2880" w:hanging="360"/>
+      </w:pPr>
+      <w:rPr>
+        <w:rFonts w:ascii="Symbol" w:hAnsi="Symbol" w:hint="default"/>
+      </w:rPr>
+    </w:lvl>
+    <w:lvl w:ilvl="4" w:tplc="04090003" w:tentative="1">
+      <w:start w:val="1"/>
+      <w:numFmt w:val="bullet"/>
+      <w:lvlText w:val="o"/>
+      <w:lvlJc w:val="left"/>
+      <w:pPr>
+        <w:ind w:left="3600" w:hanging="360"/>
+      </w:pPr>
+      <w:rPr>
+        <w:rFonts w:ascii="Courier New" w:hAnsi="Courier New" w:cs="Courier New" w:hint="default"/>
+      </w:rPr>
+    </w:lvl>
+    <w:lvl w:ilvl="5" w:tplc="04090005" w:tentative="1">
+      <w:start w:val="1"/>
+      <w:numFmt w:val="bullet"/>
+      <w:lvlText w:val=""/>
+      <w:lvlJc w:val="left"/>
+      <w:pPr>
+        <w:ind w:left="4320" w:hanging="360"/>
+      </w:pPr>
+      <w:rPr>
+        <w:rFonts w:ascii="Wingdings" w:hAnsi="Wingdings" w:hint="default"/>
+      </w:rPr>
+    </w:lvl>
+    <w:lvl w:ilvl="6" w:tplc="04090001" w:tentative="1">
+      <w:start w:val="1"/>
+      <w:numFmt w:val="bullet"/>
+      <w:lvlText w:val=""/>
+      <w:lvlJc w:val="left"/>
+      <w:pPr>
+        <w:ind w:left="5040" w:hanging="360"/>
+      </w:pPr>
+      <w:rPr>
+        <w:rFonts w:ascii="Symbol" w:hAnsi="Symbol" w:hint="default"/>
+      </w:rPr>
+    </w:lvl>
+    <w:lvl w:ilvl="7" w:tplc="04090003" w:tentative="1">
+      <w:start w:val="1"/>
+      <w:numFmt w:val="bullet"/>
+      <w:lvlText w:val="o"/>
+      <w:lvlJc w:val="left"/>
+      <w:pPr>
+        <w:ind w:left="5760" w:hanging="360"/>
+      </w:pPr>
+      <w:rPr>
+        <w:rFonts w:ascii="Courier New" w:hAnsi="Courier New" w:cs="Courier New" w:hint="default"/>
+      </w:rPr>
+    </w:lvl>
+    <w:lvl w:ilvl="8" w:tplc="04090005" w:tentative="1">
+      <w:start w:val="1"/>
+      <w:numFmt w:val="bullet"/>
+      <w:lvlText w:val=""/>
+      <w:lvlJc w:val="left"/>
+      <w:pPr>
+        <w:ind w:left="6480" w:hanging="360"/>
+      </w:pPr>
+      <w:rPr>
+        <w:rFonts w:ascii="Wingdings" w:hAnsi="Wingdings" w:hint="default"/>
+      </w:rPr>
+    </w:lvl>
+  </w:abstractNum>
+  <w:abstractNum w:abstractNumId="12" w15:restartNumberingAfterBreak="0">
     <w:nsid w:val="686F2D3F"/>
     <w:multiLevelType w:val="hybridMultilevel"/>
     <w:tmpl w:val="E4CE448E"/>
@@ -3383,7 +4377,7 @@
       </w:pPr>
     </w:lvl>
   </w:abstractNum>
-  <w:abstractNum w:abstractNumId="5" w15:restartNumberingAfterBreak="0">
+  <w:abstractNum w:abstractNumId="13" w15:restartNumberingAfterBreak="0">
     <w:nsid w:val="6C833018"/>
     <w:multiLevelType w:val="hybridMultilevel"/>
     <w:tmpl w:val="1FD45FEA"/>
@@ -3472,7 +4466,7 @@
       </w:pPr>
     </w:lvl>
   </w:abstractNum>
-  <w:abstractNum w:abstractNumId="6" w15:restartNumberingAfterBreak="0">
+  <w:abstractNum w:abstractNumId="14" w15:restartNumberingAfterBreak="0">
     <w:nsid w:val="7577240C"/>
     <w:multiLevelType w:val="hybridMultilevel"/>
     <w:tmpl w:val="4B768118"/>
@@ -3585,32 +4579,145 @@
       </w:rPr>
     </w:lvl>
   </w:abstractNum>
-  <w:num w:numId="1" w16cid:durableId="1521703667">
+  <w:abstractNum w:abstractNumId="15" w15:restartNumberingAfterBreak="0">
+    <w:nsid w:val="7EE027D1"/>
+    <w:multiLevelType w:val="hybridMultilevel"/>
+    <w:tmpl w:val="58203784"/>
+    <w:lvl w:ilvl="0" w:tplc="0409000F">
+      <w:start w:val="1"/>
+      <w:numFmt w:val="decimal"/>
+      <w:lvlText w:val="%1."/>
+      <w:lvlJc w:val="left"/>
+      <w:pPr>
+        <w:ind w:left="1080" w:hanging="360"/>
+      </w:pPr>
+    </w:lvl>
+    <w:lvl w:ilvl="1" w:tplc="04090019" w:tentative="1">
+      <w:start w:val="1"/>
+      <w:numFmt w:val="lowerLetter"/>
+      <w:lvlText w:val="%2."/>
+      <w:lvlJc w:val="left"/>
+      <w:pPr>
+        <w:ind w:left="1800" w:hanging="360"/>
+      </w:pPr>
+    </w:lvl>
+    <w:lvl w:ilvl="2" w:tplc="0409001B" w:tentative="1">
+      <w:start w:val="1"/>
+      <w:numFmt w:val="lowerRoman"/>
+      <w:lvlText w:val="%3."/>
+      <w:lvlJc w:val="right"/>
+      <w:pPr>
+        <w:ind w:left="2520" w:hanging="180"/>
+      </w:pPr>
+    </w:lvl>
+    <w:lvl w:ilvl="3" w:tplc="0409000F" w:tentative="1">
+      <w:start w:val="1"/>
+      <w:numFmt w:val="decimal"/>
+      <w:lvlText w:val="%4."/>
+      <w:lvlJc w:val="left"/>
+      <w:pPr>
+        <w:ind w:left="3240" w:hanging="360"/>
+      </w:pPr>
+    </w:lvl>
+    <w:lvl w:ilvl="4" w:tplc="04090019" w:tentative="1">
+      <w:start w:val="1"/>
+      <w:numFmt w:val="lowerLetter"/>
+      <w:lvlText w:val="%5."/>
+      <w:lvlJc w:val="left"/>
+      <w:pPr>
+        <w:ind w:left="3960" w:hanging="360"/>
+      </w:pPr>
+    </w:lvl>
+    <w:lvl w:ilvl="5" w:tplc="0409001B" w:tentative="1">
+      <w:start w:val="1"/>
+      <w:numFmt w:val="lowerRoman"/>
+      <w:lvlText w:val="%6."/>
+      <w:lvlJc w:val="right"/>
+      <w:pPr>
+        <w:ind w:left="4680" w:hanging="180"/>
+      </w:pPr>
+    </w:lvl>
+    <w:lvl w:ilvl="6" w:tplc="0409000F" w:tentative="1">
+      <w:start w:val="1"/>
+      <w:numFmt w:val="decimal"/>
+      <w:lvlText w:val="%7."/>
+      <w:lvlJc w:val="left"/>
+      <w:pPr>
+        <w:ind w:left="5400" w:hanging="360"/>
+      </w:pPr>
+    </w:lvl>
+    <w:lvl w:ilvl="7" w:tplc="04090019" w:tentative="1">
+      <w:start w:val="1"/>
+      <w:numFmt w:val="lowerLetter"/>
+      <w:lvlText w:val="%8."/>
+      <w:lvlJc w:val="left"/>
+      <w:pPr>
+        <w:ind w:left="6120" w:hanging="360"/>
+      </w:pPr>
+    </w:lvl>
+    <w:lvl w:ilvl="8" w:tplc="0409001B" w:tentative="1">
+      <w:start w:val="1"/>
+      <w:numFmt w:val="lowerRoman"/>
+      <w:lvlText w:val="%9."/>
+      <w:lvlJc w:val="right"/>
+      <w:pPr>
+        <w:ind w:left="6840" w:hanging="180"/>
+      </w:pPr>
+    </w:lvl>
+  </w:abstractNum>
+  <w:num w:numId="1">
+    <w:abstractNumId w:val="7"/>
+  </w:num>
+  <w:num w:numId="2">
+    <w:abstractNumId w:val="8"/>
+  </w:num>
+  <w:num w:numId="3">
+    <w:abstractNumId w:val="1"/>
+  </w:num>
+  <w:num w:numId="4">
+    <w:abstractNumId w:val="13"/>
+  </w:num>
+  <w:num w:numId="5">
+    <w:abstractNumId w:val="6"/>
+  </w:num>
+  <w:num w:numId="6">
+    <w:abstractNumId w:val="12"/>
+  </w:num>
+  <w:num w:numId="7">
+    <w:abstractNumId w:val="14"/>
+  </w:num>
+  <w:num w:numId="8">
+    <w:abstractNumId w:val="9"/>
+  </w:num>
+  <w:num w:numId="9">
+    <w:abstractNumId w:val="0"/>
+  </w:num>
+  <w:num w:numId="10">
+    <w:abstractNumId w:val="5"/>
+  </w:num>
+  <w:num w:numId="11">
+    <w:abstractNumId w:val="4"/>
+  </w:num>
+  <w:num w:numId="12">
+    <w:abstractNumId w:val="11"/>
+  </w:num>
+  <w:num w:numId="13">
+    <w:abstractNumId w:val="15"/>
+  </w:num>
+  <w:num w:numId="14">
+    <w:abstractNumId w:val="3"/>
+  </w:num>
+  <w:num w:numId="15">
     <w:abstractNumId w:val="2"/>
   </w:num>
-  <w:num w:numId="2" w16cid:durableId="1192451426">
-    <w:abstractNumId w:val="3"/>
-  </w:num>
-  <w:num w:numId="3" w16cid:durableId="1769034931">
-    <w:abstractNumId w:val="0"/>
-  </w:num>
-  <w:num w:numId="4" w16cid:durableId="959531810">
-    <w:abstractNumId w:val="5"/>
-  </w:num>
-  <w:num w:numId="5" w16cid:durableId="893854713">
-    <w:abstractNumId w:val="1"/>
-  </w:num>
-  <w:num w:numId="6" w16cid:durableId="985860105">
-    <w:abstractNumId w:val="4"/>
-  </w:num>
-  <w:num w:numId="7" w16cid:durableId="504787989">
-    <w:abstractNumId w:val="6"/>
+  <w:num w:numId="16">
+    <w:abstractNumId w:val="10"/>
   </w:num>
 </w:numbering>
 </file>
 
 <file path=word/styles.xml><?xml version="1.0" encoding="utf-8"?>
-<w:styles xmlns:mc="http://schemas.openxmlformats.org/markup-compatibility/2006" xmlns:r="http://schemas.openxmlformats.org/officeDocument/2006/relationships" xmlns:w="http://schemas.openxmlformats.org/wordprocessingml/2006/main" xmlns:w14="http://schemas.microsoft.com/office/word/2010/wordml" xmlns:w15="http://schemas.microsoft.com/office/word/2012/wordml" xmlns:w16cex="http://schemas.microsoft.com/office/word/2018/wordml/cex" xmlns:w16cid="http://schemas.microsoft.com/office/word/2016/wordml/cid" xmlns:w16="http://schemas.microsoft.com/office/word/2018/wordml" xmlns:w16du="http://schemas.microsoft.com/office/word/2023/wordml/word16du" xmlns:w16sdtdh="http://schemas.microsoft.com/office/word/2020/wordml/sdtdatahash" xmlns:w16sdtfl="http://schemas.microsoft.com/office/word/2024/wordml/sdtformatlock" xmlns:w16se="http://schemas.microsoft.com/office/word/2015/wordml/symex" mc:Ignorable="w14 w15 w16se w16cid w16 w16cex w16sdtdh w16sdtfl w16du">
+<w:styles xmlns:mc="http://schemas.openxmlformats.org/markup-compatibility/2006" xmlns:r="http://schemas.openxmlformats.org/officeDocument/2006/relationships" xmlns:w="http://schemas.openxmlformats.org/wordprocessingml/2006/main" xmlns:w14="http://schemas.microsoft.com/office/word/2010/wordml" xmlns:w15="http://schemas.microsoft.com/office/word/2012/wordml" xmlns:w16se="http://schemas.microsoft.com/office/word/2015/wordml/symex" mc:Ignorable="w14 w15 w16se">
   <w:docDefaults>
     <w:rPrDefault>
       <w:rPr>
@@ -3628,7 +4735,7 @@
       </w:pPr>
     </w:pPrDefault>
   </w:docDefaults>
-  <w:latentStyles w:defLockedState="0" w:defUIPriority="99" w:defSemiHidden="0" w:defUnhideWhenUsed="0" w:defQFormat="0" w:count="376">
+  <w:latentStyles w:defLockedState="0" w:defUIPriority="99" w:defSemiHidden="0" w:defUnhideWhenUsed="0" w:defQFormat="0" w:count="371">
     <w:lsdException w:name="Normal" w:uiPriority="0" w:qFormat="1"/>
     <w:lsdException w:name="heading 1" w:uiPriority="9" w:qFormat="1"/>
     <w:lsdException w:name="heading 2" w:semiHidden="1" w:uiPriority="9" w:unhideWhenUsed="1" w:qFormat="1"/>
@@ -4000,11 +5107,6 @@
     <w:lsdException w:name="List Table 5 Dark Accent 6" w:uiPriority="50"/>
     <w:lsdException w:name="List Table 6 Colorful Accent 6" w:uiPriority="51"/>
     <w:lsdException w:name="List Table 7 Colorful Accent 6" w:uiPriority="52"/>
-    <w:lsdException w:name="Mention" w:semiHidden="1" w:unhideWhenUsed="1"/>
-    <w:lsdException w:name="Smart Hyperlink" w:semiHidden="1" w:unhideWhenUsed="1"/>
-    <w:lsdException w:name="Hashtag" w:semiHidden="1" w:unhideWhenUsed="1"/>
-    <w:lsdException w:name="Unresolved Mention" w:semiHidden="1" w:unhideWhenUsed="1"/>
-    <w:lsdException w:name="Smart Link" w:semiHidden="1" w:unhideWhenUsed="1"/>
   </w:latentStyles>
   <w:style w:type="paragraph" w:default="1" w:styleId="Normal">
     <w:name w:val="Normal"/>
@@ -4022,18 +5124,17 @@
     <w:link w:val="Heading1Char"/>
     <w:uiPriority w:val="9"/>
     <w:qFormat/>
-    <w:rsid w:val="006413C3"/>
+    <w:rsid w:val="001F5C1F"/>
     <w:pPr>
       <w:keepNext/>
       <w:keepLines/>
       <w:spacing w:before="360" w:after="80" w:line="480" w:lineRule="auto"/>
-      <w:jc w:val="center"/>
       <w:outlineLvl w:val="0"/>
     </w:pPr>
     <w:rPr>
       <w:rFonts w:eastAsiaTheme="majorEastAsia" w:cstheme="majorBidi"/>
       <w:b/>
-      <w:sz w:val="32"/>
+      <w:sz w:val="30"/>
       <w:szCs w:val="40"/>
     </w:rPr>
   </w:style>
@@ -4067,7 +5168,7 @@
     <w:uiPriority w:val="9"/>
     <w:unhideWhenUsed/>
     <w:qFormat/>
-    <w:rsid w:val="00AA5AD0"/>
+    <w:rsid w:val="001F5C1F"/>
     <w:pPr>
       <w:keepNext/>
       <w:keepLines/>
@@ -4077,7 +5178,6 @@
     <w:rPr>
       <w:rFonts w:eastAsiaTheme="majorEastAsia" w:cstheme="majorBidi"/>
       <w:b/>
-      <w:sz w:val="28"/>
       <w:szCs w:val="28"/>
     </w:rPr>
   </w:style>
@@ -4216,6 +5316,7 @@
   <w:style w:type="character" w:default="1" w:styleId="DefaultParagraphFont">
     <w:name w:val="Default Paragraph Font"/>
     <w:uiPriority w:val="1"/>
+    <w:semiHidden/>
     <w:unhideWhenUsed/>
   </w:style>
   <w:style w:type="table" w:default="1" w:styleId="TableNormal">
@@ -4244,11 +5345,11 @@
     <w:basedOn w:val="DefaultParagraphFont"/>
     <w:link w:val="Heading1"/>
     <w:uiPriority w:val="9"/>
-    <w:rsid w:val="006413C3"/>
+    <w:rsid w:val="001F5C1F"/>
     <w:rPr>
       <w:rFonts w:ascii="Times New Roman" w:eastAsiaTheme="majorEastAsia" w:hAnsi="Times New Roman" w:cstheme="majorBidi"/>
       <w:b/>
-      <w:sz w:val="32"/>
+      <w:sz w:val="30"/>
       <w:szCs w:val="40"/>
     </w:rPr>
   </w:style>
@@ -4270,11 +5371,11 @@
     <w:basedOn w:val="DefaultParagraphFont"/>
     <w:link w:val="Heading3"/>
     <w:uiPriority w:val="9"/>
-    <w:rsid w:val="00AA5AD0"/>
+    <w:rsid w:val="001F5C1F"/>
     <w:rPr>
       <w:rFonts w:ascii="Times New Roman" w:eastAsiaTheme="majorEastAsia" w:hAnsi="Times New Roman" w:cstheme="majorBidi"/>
       <w:b/>
-      <w:sz w:val="28"/>
+      <w:sz w:val="26"/>
       <w:szCs w:val="28"/>
     </w:rPr>
   </w:style>
@@ -4555,7 +5656,7 @@
       <w:u w:val="single"/>
     </w:rPr>
   </w:style>
-  <w:style w:type="character" w:styleId="UnresolvedMention">
+  <w:style w:type="character" w:customStyle="1" w:styleId="UnresolvedMention">
     <w:name w:val="Unresolved Mention"/>
     <w:basedOn w:val="DefaultParagraphFont"/>
     <w:uiPriority w:val="99"/>
@@ -5126,7 +6227,7 @@
 </file>
 
 <file path=customXml/itemProps1.xml><?xml version="1.0" encoding="utf-8"?>
-<ds:datastoreItem xmlns:ds="http://schemas.openxmlformats.org/officeDocument/2006/customXml" ds:itemID="{404B66A3-77A4-4C75-8F74-E4790825FA3A}">
+<ds:datastoreItem xmlns:ds="http://schemas.openxmlformats.org/officeDocument/2006/customXml" ds:itemID="{07788B7A-7163-4ED7-ADC2-E7A0A1A96EE8}">
   <ds:schemaRefs>
     <ds:schemaRef ds:uri="http://schemas.openxmlformats.org/officeDocument/2006/bibliography"/>
   </ds:schemaRefs>

</xml_diff>

<commit_message>
Cap nhat mo hinh hoa quy trinh thanh toan
</commit_message>
<xml_diff>
--- a/He_thong_thong_tin_giai_quyet_hanh_chinh/LE THI HOAI THANH_25410307/LeThiHoaiThanh_25410307.docx
+++ b/He_thong_thong_tin_giai_quyet_hanh_chinh/LE THI HOAI THANH_25410307/LeThiHoaiThanh_25410307.docx
@@ -6491,27 +6491,14 @@
       <w:r>
         <w:t xml:space="preserve">Hình </w:t>
       </w:r>
-      <w:r>
-        <w:fldChar w:fldCharType="begin"/>
-      </w:r>
-      <w:r>
-        <w:instrText xml:space="preserve"> SEQ Hình \* ARABIC </w:instrText>
-      </w:r>
-      <w:r>
-        <w:fldChar w:fldCharType="separate"/>
-      </w:r>
-      <w:r>
-        <w:rPr>
-          <w:noProof/>
-        </w:rPr>
-        <w:t>1</w:t>
-      </w:r>
-      <w:r>
-        <w:rPr>
-          <w:noProof/>
-        </w:rPr>
-        <w:fldChar w:fldCharType="end"/>
-      </w:r>
+      <w:fldSimple w:instr=" SEQ Hình \* ARABIC ">
+        <w:r>
+          <w:rPr>
+            <w:noProof/>
+          </w:rPr>
+          <w:t>1</w:t>
+        </w:r>
+      </w:fldSimple>
       <w:r>
         <w:t>. Quy trình tiếp nhận hồ sơ</w:t>
       </w:r>
@@ -6830,27 +6817,14 @@
       <w:r>
         <w:t xml:space="preserve">Hình </w:t>
       </w:r>
-      <w:r>
-        <w:fldChar w:fldCharType="begin"/>
-      </w:r>
-      <w:r>
-        <w:instrText xml:space="preserve"> SEQ Hình \* ARABIC </w:instrText>
-      </w:r>
-      <w:r>
-        <w:fldChar w:fldCharType="separate"/>
-      </w:r>
-      <w:r>
-        <w:rPr>
-          <w:noProof/>
-        </w:rPr>
-        <w:t>2</w:t>
-      </w:r>
-      <w:r>
-        <w:rPr>
-          <w:noProof/>
-        </w:rPr>
-        <w:fldChar w:fldCharType="end"/>
-      </w:r>
+      <w:fldSimple w:instr=" SEQ Hình \* ARABIC ">
+        <w:r>
+          <w:rPr>
+            <w:noProof/>
+          </w:rPr>
+          <w:t>2</w:t>
+        </w:r>
+      </w:fldSimple>
       <w:r>
         <w:t>. Quy trình kiểm tra, thẩm định và xử lý hồ sơ</w:t>
       </w:r>
@@ -7138,27 +7112,14 @@
       <w:r>
         <w:t xml:space="preserve">Hình </w:t>
       </w:r>
-      <w:r>
-        <w:fldChar w:fldCharType="begin"/>
-      </w:r>
-      <w:r>
-        <w:instrText xml:space="preserve"> SEQ Hình \* ARABIC </w:instrText>
-      </w:r>
-      <w:r>
-        <w:fldChar w:fldCharType="separate"/>
-      </w:r>
-      <w:r>
-        <w:rPr>
-          <w:noProof/>
-        </w:rPr>
-        <w:t>3</w:t>
-      </w:r>
-      <w:r>
-        <w:rPr>
-          <w:noProof/>
-        </w:rPr>
-        <w:fldChar w:fldCharType="end"/>
-      </w:r>
+      <w:fldSimple w:instr=" SEQ Hình \* ARABIC ">
+        <w:r>
+          <w:rPr>
+            <w:noProof/>
+          </w:rPr>
+          <w:t>3</w:t>
+        </w:r>
+      </w:fldSimple>
       <w:r>
         <w:t>. Quy trình phê duyệt và ban hành kết quả</w:t>
       </w:r>
@@ -7379,27 +7340,14 @@
       <w:r>
         <w:t xml:space="preserve">Hình </w:t>
       </w:r>
-      <w:r>
-        <w:fldChar w:fldCharType="begin"/>
-      </w:r>
-      <w:r>
-        <w:instrText xml:space="preserve"> SEQ Hình \* ARABIC </w:instrText>
-      </w:r>
-      <w:r>
-        <w:fldChar w:fldCharType="separate"/>
-      </w:r>
-      <w:r>
-        <w:rPr>
-          <w:noProof/>
-        </w:rPr>
-        <w:t>4</w:t>
-      </w:r>
-      <w:r>
-        <w:rPr>
-          <w:noProof/>
-        </w:rPr>
-        <w:fldChar w:fldCharType="end"/>
-      </w:r>
+      <w:fldSimple w:instr=" SEQ Hình \* ARABIC ">
+        <w:r>
+          <w:rPr>
+            <w:noProof/>
+          </w:rPr>
+          <w:t>4</w:t>
+        </w:r>
+      </w:fldSimple>
       <w:r>
         <w:t>. Quy trình trả kết quả và thông báo</w:t>
       </w:r>
@@ -11817,27 +11765,14 @@
       <w:r>
         <w:t xml:space="preserve">Hình </w:t>
       </w:r>
-      <w:r>
-        <w:fldChar w:fldCharType="begin"/>
-      </w:r>
-      <w:r>
-        <w:instrText xml:space="preserve"> SEQ Hình \* ARABIC </w:instrText>
-      </w:r>
-      <w:r>
-        <w:fldChar w:fldCharType="separate"/>
-      </w:r>
-      <w:r>
-        <w:rPr>
-          <w:noProof/>
-        </w:rPr>
-        <w:t>5</w:t>
-      </w:r>
-      <w:r>
-        <w:rPr>
-          <w:noProof/>
-        </w:rPr>
-        <w:fldChar w:fldCharType="end"/>
-      </w:r>
+      <w:fldSimple w:instr=" SEQ Hình \* ARABIC ">
+        <w:r>
+          <w:rPr>
+            <w:noProof/>
+          </w:rPr>
+          <w:t>5</w:t>
+        </w:r>
+      </w:fldSimple>
       <w:r>
         <w:t>. Mô hình hóa q</w:t>
       </w:r>
@@ -16011,13 +15946,14 @@
           <w:szCs w:val="24"/>
         </w:rPr>
       </w:pPr>
+      <w:bookmarkStart w:id="49" w:name="_GoBack"/>
       <w:r>
         <w:rPr>
           <w:rFonts w:cs="Times New Roman"/>
           <w:sz w:val="24"/>
           <w:szCs w:val="24"/>
         </w:rPr>
-        <w:t xml:space="preserve">2.4.2.1 Phân </w:t>
+        <w:t>2.4.2.2</w:t>
       </w:r>
       <w:r>
         <w:rPr>
@@ -16025,9 +15961,10 @@
           <w:sz w:val="24"/>
           <w:szCs w:val="24"/>
         </w:rPr>
-        <w:t>tích quy trình</w:t>
-      </w:r>
-    </w:p>
+        <w:t xml:space="preserve"> Phân tích quy trình</w:t>
+      </w:r>
+    </w:p>
+    <w:bookmarkEnd w:id="49"/>
     <w:p>
       <w:pPr>
         <w:jc w:val="both"/>
@@ -16043,34 +15980,34 @@
           <w:sz w:val="24"/>
           <w:szCs w:val="24"/>
         </w:rPr>
-        <w:t>K</w:t>
-      </w:r>
-      <w:r>
+        <w:t>KHÁI QUÁT MÔ HÌNH HÓA QUY TRÌNH</w:t>
+      </w:r>
+    </w:p>
+    <w:p>
+      <w:pPr>
+        <w:ind w:firstLine="720"/>
+        <w:jc w:val="both"/>
         <w:rPr>
           <w:rFonts w:cs="Times New Roman"/>
           <w:sz w:val="24"/>
           <w:szCs w:val="24"/>
         </w:rPr>
-        <w:t>HÁI QUÁT MÔ HÌNH HÓA QUY TRÌNH</w:t>
-      </w:r>
-    </w:p>
-    <w:p>
-      <w:pPr>
-        <w:ind w:firstLine="720"/>
-        <w:jc w:val="both"/>
+      </w:pPr>
+      <w:r>
         <w:rPr>
           <w:rFonts w:cs="Times New Roman"/>
           <w:sz w:val="24"/>
           <w:szCs w:val="24"/>
         </w:rPr>
-      </w:pPr>
+        <w:t>Quy trình thanh toán trực tuyến trên Cổng Dịch vụ công Quốc gia được mô hình hóa bằng BPMN (Business Process Model and Notation) nhằm mô tả trực quan quá trình thực hiện nghĩa vụ tài chính của người dân hoặc tổ chức trong quá trình giải quyết thủ tục hành chính.</w:t>
+      </w:r>
       <w:r>
         <w:rPr>
           <w:rFonts w:cs="Times New Roman"/>
           <w:sz w:val="24"/>
           <w:szCs w:val="24"/>
         </w:rPr>
-        <w:t>Quy trình thanh toán trực tuyến trên Cổng Dịch vụ công Quốc gia được mô hình hóa bằng BPMN (Business Process Model and Notation) nhằm mô tả trực quan quá trình thực hiện nghĩa vụ tài chính của người dân hoặc tổ chức trong quá trình giải quyết thủ tục hành chính.</w:t>
+        <w:t xml:space="preserve"> </w:t>
       </w:r>
       <w:r>
         <w:rPr>
@@ -16078,23 +16015,7 @@
           <w:sz w:val="24"/>
           <w:szCs w:val="24"/>
         </w:rPr>
-        <w:t xml:space="preserve"> </w:t>
-      </w:r>
-      <w:r>
-        <w:rPr>
-          <w:rFonts w:cs="Times New Roman"/>
-          <w:sz w:val="24"/>
-          <w:szCs w:val="24"/>
-        </w:rPr>
-        <w:t xml:space="preserve">Mô hình </w:t>
-      </w:r>
-      <w:r>
-        <w:rPr>
-          <w:rFonts w:cs="Times New Roman"/>
-          <w:sz w:val="24"/>
-          <w:szCs w:val="24"/>
-        </w:rPr>
-        <w:t>thể hiện sự phối hợp giữa các tác nhân gồm người dân hoặc tổ chức, hệ thống thông tin giải quyết thủ tục hành chính, cổng thanh toán điện tử, ngân hàng hoặc tổ chức cung ứng dịch vụ thanh toán và cơ quan giải quyết thủ tục hành chính.</w:t>
+        <w:t>Mô hình thể hiện sự phối hợp giữa các tác nhân gồm người dân hoặc tổ chức, hệ thống thông tin giải quyết thủ tục hành chính, cổng thanh toán điện tử, ngân hàng hoặc tổ chức cung ứng dịch vụ thanh toán và cơ quan giải quyết thủ tục hành chính.</w:t>
       </w:r>
     </w:p>
     <w:p>
@@ -16382,13 +16303,7 @@
         <w:jc w:val="both"/>
       </w:pPr>
       <w:r>
-        <w:t>Người dân hoặc tổ chức kiểm tra số tiền cần thanh toán được hiển thị trên hệ thống trước khi thực hiện giao dịch. Thông tin có thể bao gồm số tiền, nội dung khoản thu, mã hồ sơ và các thông tin liên quan đến nghĩa vụ tài chính.</w:t>
-      </w:r>
-      <w:r>
-        <w:t xml:space="preserve"> </w:t>
-      </w:r>
-      <w:r>
-        <w:t xml:space="preserve">Nếu người dùng xác nhận tiếp tục, quy trình </w:t>
+        <w:t xml:space="preserve">Người dân hoặc tổ chức kiểm tra số tiền cần thanh toán được hiển thị trên hệ thống trước khi thực hiện giao dịch. Thông tin có thể bao gồm số tiền, nội dung khoản thu, mã hồ sơ và các thông tin liên quan đến nghĩa vụ tài chính. Nếu người dùng xác nhận tiếp tục, quy trình </w:t>
       </w:r>
       <w:r>
         <w:lastRenderedPageBreak/>
@@ -16524,13 +16439,7 @@
         <w:jc w:val="both"/>
       </w:pPr>
       <w:r>
-        <w:t>Sau khi lựa chọn phương thức, người dùng thực hiện xác thực giao dịch theo yêu cầu của ngân hàng hoặc tổ chức cung ứng dịch vụ thanh toán. Phương thức xác thực có thể bao gồm OTP, Smart OTP, sinh trắc học hoặc phương thức xác thực khác.</w:t>
-      </w:r>
-      <w:r>
-        <w:t xml:space="preserve"> </w:t>
-      </w:r>
-      <w:r>
-        <w:t>Nếu thông tin xác thực không hợp lệ hoặc người dùng không xác nhận giao dịch, hệ thống thông báo lỗi và cho phép người dùng thực hiện lại hoặc kết thúc giao dịch.</w:t>
+        <w:t>Sau khi lựa chọn phương thức, người dùng thực hiện xác thực giao dịch theo yêu cầu của ngân hàng hoặc tổ chức cung ứng dịch vụ thanh toán. Phương thức xác thực có thể bao gồm OTP, Smart OTP, sinh trắc học hoặc phương thức xác thực khác. Nếu thông tin xác thực không hợp lệ hoặc người dùng không xác nhận giao dịch, hệ thống thông báo lỗi và cho phép người dùng thực hiện lại hoặc kết thúc giao dịch.</w:t>
       </w:r>
     </w:p>
     <w:p>
@@ -16590,13 +16499,7 @@
         <w:jc w:val="both"/>
       </w:pPr>
       <w:r>
-        <w:t xml:space="preserve">Hệ thống thông tin giải quyết thủ tục hành chính tiếp nhận yêu cầu thanh toán và thực hiện kiểm tra các thông tin cần thiết của giao dịch, bao gồm thông tin hồ sơ, số tiền phải thanh toán và các thông tin liên </w:t>
-      </w:r>
-      <w:r>
-        <w:t xml:space="preserve">quan. </w:t>
-      </w:r>
-      <w:r>
-        <w:t>Quá trình kiểm tra được thực hiện theo các nội dung:</w:t>
+        <w:t>Hệ thống thông tin giải quyết thủ tục hành chính tiếp nhận yêu cầu thanh toán và thực hiện kiểm tra các thông tin cần thiết của giao dịch, bao gồm thông tin hồ sơ, số tiền phải thanh toán và các thông tin liên quan. Quá trình kiểm tra được thực hiện theo các nội dung:</w:t>
       </w:r>
     </w:p>
     <w:p>
@@ -17012,13 +16915,7 @@
         <w:jc w:val="both"/>
       </w:pPr>
       <w:r>
-        <w:t>Cổng thanh toán tiếp nhận kết quả xử lý từ ngân hàng hoặc tổ chức cung ứng dịch vụ th</w:t>
-      </w:r>
-      <w:r>
-        <w:t>anh toán và chuyển kết quả về h</w:t>
-      </w:r>
-      <w:r>
-        <w:t>ệ thống thông tin giải quyết thủ tục hành chính.Hệ thống xác định trạng thái cuối cùng hoặc trạng thái cần tiếp tục xử lý của giao dịch.Các kết quả có thể bao gồm:</w:t>
+        <w:t>Cổng thanh toán tiếp nhận kết quả xử lý từ ngân hàng hoặc tổ chức cung ứng dịch vụ thanh toán và chuyển kết quả về hệ thống thông tin giải quyết thủ tục hành chính.Hệ thống xác định trạng thái cuối cùng hoặc trạng thái cần tiếp tục xử lý của giao dịch.Các kết quả có thể bao gồm:</w:t>
       </w:r>
     </w:p>
     <w:p>
@@ -18622,8 +18519,6 @@
         <w:ind w:firstLine="720"/>
         <w:jc w:val="both"/>
       </w:pPr>
-      <w:bookmarkStart w:id="49" w:name="_GoBack"/>
-      <w:bookmarkEnd w:id="49"/>
       <w:r>
         <w:t xml:space="preserve">Sau khi giao dịch đã có kết quả cuối cùng, dù </w:t>
       </w:r>
@@ -19146,7 +19041,7 @@
             <w:noProof/>
             <w:szCs w:val="26"/>
           </w:rPr>
-          <w:t>34</w:t>
+          <w:t>38</w:t>
         </w:r>
         <w:r>
           <w:rPr>
@@ -25269,7 +25164,7 @@
 </file>
 
 <file path=customXml/itemProps1.xml><?xml version="1.0" encoding="utf-8"?>
-<ds:datastoreItem xmlns:ds="http://schemas.openxmlformats.org/officeDocument/2006/customXml" ds:itemID="{1B67B4BD-D2B2-4AA9-906D-F21BBF974020}">
+<ds:datastoreItem xmlns:ds="http://schemas.openxmlformats.org/officeDocument/2006/customXml" ds:itemID="{F2937A80-EBC6-46C0-8354-B722FD2BBE1E}">
   <ds:schemaRefs>
     <ds:schemaRef ds:uri="http://schemas.openxmlformats.org/officeDocument/2006/bibliography"/>
   </ds:schemaRefs>

</xml_diff>

<commit_message>
Sửa lại sơ đồ QT thanh toán
</commit_message>
<xml_diff>
--- a/He_thong_thong_tin_giai_quyet_hanh_chinh/LE THI HOAI THANH_25410307/LeThiHoaiThanh_25410307.docx
+++ b/He_thong_thong_tin_giai_quyet_hanh_chinh/LE THI HOAI THANH_25410307/LeThiHoaiThanh_25410307.docx
@@ -6491,14 +6491,27 @@
       <w:r>
         <w:t xml:space="preserve">Hình </w:t>
       </w:r>
-      <w:fldSimple w:instr=" SEQ Hình \* ARABIC ">
-        <w:r>
-          <w:rPr>
-            <w:noProof/>
-          </w:rPr>
-          <w:t>1</w:t>
-        </w:r>
-      </w:fldSimple>
+      <w:r>
+        <w:fldChar w:fldCharType="begin"/>
+      </w:r>
+      <w:r>
+        <w:instrText xml:space="preserve"> SEQ Hình \* ARABIC </w:instrText>
+      </w:r>
+      <w:r>
+        <w:fldChar w:fldCharType="separate"/>
+      </w:r>
+      <w:r>
+        <w:rPr>
+          <w:noProof/>
+        </w:rPr>
+        <w:t>1</w:t>
+      </w:r>
+      <w:r>
+        <w:rPr>
+          <w:noProof/>
+        </w:rPr>
+        <w:fldChar w:fldCharType="end"/>
+      </w:r>
       <w:r>
         <w:t>. Quy trình tiếp nhận hồ sơ</w:t>
       </w:r>
@@ -6817,14 +6830,27 @@
       <w:r>
         <w:t xml:space="preserve">Hình </w:t>
       </w:r>
-      <w:fldSimple w:instr=" SEQ Hình \* ARABIC ">
-        <w:r>
-          <w:rPr>
-            <w:noProof/>
-          </w:rPr>
-          <w:t>2</w:t>
-        </w:r>
-      </w:fldSimple>
+      <w:r>
+        <w:fldChar w:fldCharType="begin"/>
+      </w:r>
+      <w:r>
+        <w:instrText xml:space="preserve"> SEQ Hình \* ARABIC </w:instrText>
+      </w:r>
+      <w:r>
+        <w:fldChar w:fldCharType="separate"/>
+      </w:r>
+      <w:r>
+        <w:rPr>
+          <w:noProof/>
+        </w:rPr>
+        <w:t>2</w:t>
+      </w:r>
+      <w:r>
+        <w:rPr>
+          <w:noProof/>
+        </w:rPr>
+        <w:fldChar w:fldCharType="end"/>
+      </w:r>
       <w:r>
         <w:t>. Quy trình kiểm tra, thẩm định và xử lý hồ sơ</w:t>
       </w:r>
@@ -7112,14 +7138,27 @@
       <w:r>
         <w:t xml:space="preserve">Hình </w:t>
       </w:r>
-      <w:fldSimple w:instr=" SEQ Hình \* ARABIC ">
-        <w:r>
-          <w:rPr>
-            <w:noProof/>
-          </w:rPr>
-          <w:t>3</w:t>
-        </w:r>
-      </w:fldSimple>
+      <w:r>
+        <w:fldChar w:fldCharType="begin"/>
+      </w:r>
+      <w:r>
+        <w:instrText xml:space="preserve"> SEQ Hình \* ARABIC </w:instrText>
+      </w:r>
+      <w:r>
+        <w:fldChar w:fldCharType="separate"/>
+      </w:r>
+      <w:r>
+        <w:rPr>
+          <w:noProof/>
+        </w:rPr>
+        <w:t>3</w:t>
+      </w:r>
+      <w:r>
+        <w:rPr>
+          <w:noProof/>
+        </w:rPr>
+        <w:fldChar w:fldCharType="end"/>
+      </w:r>
       <w:r>
         <w:t>. Quy trình phê duyệt và ban hành kết quả</w:t>
       </w:r>
@@ -7340,14 +7379,27 @@
       <w:r>
         <w:t xml:space="preserve">Hình </w:t>
       </w:r>
-      <w:fldSimple w:instr=" SEQ Hình \* ARABIC ">
-        <w:r>
-          <w:rPr>
-            <w:noProof/>
-          </w:rPr>
-          <w:t>4</w:t>
-        </w:r>
-      </w:fldSimple>
+      <w:r>
+        <w:fldChar w:fldCharType="begin"/>
+      </w:r>
+      <w:r>
+        <w:instrText xml:space="preserve"> SEQ Hình \* ARABIC </w:instrText>
+      </w:r>
+      <w:r>
+        <w:fldChar w:fldCharType="separate"/>
+      </w:r>
+      <w:r>
+        <w:rPr>
+          <w:noProof/>
+        </w:rPr>
+        <w:t>4</w:t>
+      </w:r>
+      <w:r>
+        <w:rPr>
+          <w:noProof/>
+        </w:rPr>
+        <w:fldChar w:fldCharType="end"/>
+      </w:r>
       <w:r>
         <w:t>. Quy trình trả kết quả và thông báo</w:t>
       </w:r>
@@ -11765,14 +11817,27 @@
       <w:r>
         <w:t xml:space="preserve">Hình </w:t>
       </w:r>
-      <w:fldSimple w:instr=" SEQ Hình \* ARABIC ">
-        <w:r>
-          <w:rPr>
-            <w:noProof/>
-          </w:rPr>
-          <w:t>5</w:t>
-        </w:r>
-      </w:fldSimple>
+      <w:r>
+        <w:fldChar w:fldCharType="begin"/>
+      </w:r>
+      <w:r>
+        <w:instrText xml:space="preserve"> SEQ Hình \* ARABIC </w:instrText>
+      </w:r>
+      <w:r>
+        <w:fldChar w:fldCharType="separate"/>
+      </w:r>
+      <w:r>
+        <w:rPr>
+          <w:noProof/>
+        </w:rPr>
+        <w:t>5</w:t>
+      </w:r>
+      <w:r>
+        <w:rPr>
+          <w:noProof/>
+        </w:rPr>
+        <w:fldChar w:fldCharType="end"/>
+      </w:r>
       <w:r>
         <w:t>. Mô hình hóa q</w:t>
       </w:r>
@@ -14105,15 +14170,16 @@
       </w:r>
     </w:p>
     <w:p>
+      <w:bookmarkStart w:id="49" w:name="_GoBack"/>
       <w:r>
         <w:rPr>
           <w:noProof/>
         </w:rPr>
         <w:drawing>
-          <wp:inline distT="0" distB="0" distL="0" distR="0" wp14:anchorId="6283A860" wp14:editId="0A1BEE0F">
+          <wp:inline distT="0" distB="0" distL="0" distR="0" wp14:anchorId="112B13F8" wp14:editId="38CF95C5">
             <wp:extent cx="5731510" cy="3819525"/>
             <wp:effectExtent l="0" t="0" r="2540" b="9525"/>
-            <wp:docPr id="2" name="Picture 2"/>
+            <wp:docPr id="1" name="Picture 1"/>
             <wp:cNvGraphicFramePr>
               <a:graphicFrameLocks xmlns:a="http://schemas.openxmlformats.org/drawingml/2006/main" noChangeAspect="1"/>
             </wp:cNvGraphicFramePr>
@@ -14121,7 +14187,7 @@
               <a:graphicData uri="http://schemas.openxmlformats.org/drawingml/2006/picture">
                 <pic:pic xmlns:pic="http://schemas.openxmlformats.org/drawingml/2006/picture">
                   <pic:nvPicPr>
-                    <pic:cNvPr id="2" name="QT_THANH_TOAN_V3_02.png"/>
+                    <pic:cNvPr id="1" name="QT_THANH_TOAN_V3_03.drawio.png"/>
                     <pic:cNvPicPr/>
                   </pic:nvPicPr>
                   <pic:blipFill>
@@ -14151,6 +14217,7 @@
           </wp:inline>
         </w:drawing>
       </w:r>
+      <w:bookmarkEnd w:id="49"/>
     </w:p>
     <w:p>
       <w:pPr>
@@ -16874,8 +16941,6 @@
         </w:rPr>
         <w:t>ng thanh toán</w:t>
       </w:r>
-      <w:bookmarkStart w:id="49" w:name="_GoBack"/>
-      <w:bookmarkEnd w:id="49"/>
     </w:p>
     <w:p>
       <w:pPr>
@@ -18554,7 +18619,7 @@
             <w:noProof/>
             <w:szCs w:val="26"/>
           </w:rPr>
-          <w:t>40</w:t>
+          <w:t>29</w:t>
         </w:r>
         <w:r>
           <w:rPr>
@@ -25721,7 +25786,7 @@
 </file>
 
 <file path=customXml/itemProps1.xml><?xml version="1.0" encoding="utf-8"?>
-<ds:datastoreItem xmlns:ds="http://schemas.openxmlformats.org/officeDocument/2006/customXml" ds:itemID="{00CAF36F-E95E-4A54-9A4B-90E6988921F7}">
+<ds:datastoreItem xmlns:ds="http://schemas.openxmlformats.org/officeDocument/2006/customXml" ds:itemID="{41901CCB-6EE6-4339-847F-D8AC423381F5}">
   <ds:schemaRefs>
     <ds:schemaRef ds:uri="http://schemas.openxmlformats.org/officeDocument/2006/bibliography"/>
   </ds:schemaRefs>

</xml_diff>

<commit_message>
Sua so do QT thanh toan
</commit_message>
<xml_diff>
--- a/He_thong_thong_tin_giai_quyet_hanh_chinh/LE THI HOAI THANH_25410307/LeThiHoaiThanh_25410307.docx
+++ b/He_thong_thong_tin_giai_quyet_hanh_chinh/LE THI HOAI THANH_25410307/LeThiHoaiThanh_25410307.docx
@@ -6491,14 +6491,27 @@
       <w:r>
         <w:t xml:space="preserve">Hình </w:t>
       </w:r>
-      <w:fldSimple w:instr=" SEQ Hình \* ARABIC ">
-        <w:r>
-          <w:rPr>
-            <w:noProof/>
-          </w:rPr>
-          <w:t>1</w:t>
-        </w:r>
-      </w:fldSimple>
+      <w:r>
+        <w:fldChar w:fldCharType="begin"/>
+      </w:r>
+      <w:r>
+        <w:instrText xml:space="preserve"> SEQ Hình \* ARABIC </w:instrText>
+      </w:r>
+      <w:r>
+        <w:fldChar w:fldCharType="separate"/>
+      </w:r>
+      <w:r>
+        <w:rPr>
+          <w:noProof/>
+        </w:rPr>
+        <w:t>1</w:t>
+      </w:r>
+      <w:r>
+        <w:rPr>
+          <w:noProof/>
+        </w:rPr>
+        <w:fldChar w:fldCharType="end"/>
+      </w:r>
       <w:r>
         <w:t>. Quy trình tiếp nhận hồ sơ</w:t>
       </w:r>
@@ -6817,14 +6830,27 @@
       <w:r>
         <w:t xml:space="preserve">Hình </w:t>
       </w:r>
-      <w:fldSimple w:instr=" SEQ Hình \* ARABIC ">
-        <w:r>
-          <w:rPr>
-            <w:noProof/>
-          </w:rPr>
-          <w:t>2</w:t>
-        </w:r>
-      </w:fldSimple>
+      <w:r>
+        <w:fldChar w:fldCharType="begin"/>
+      </w:r>
+      <w:r>
+        <w:instrText xml:space="preserve"> SEQ Hình \* ARABIC </w:instrText>
+      </w:r>
+      <w:r>
+        <w:fldChar w:fldCharType="separate"/>
+      </w:r>
+      <w:r>
+        <w:rPr>
+          <w:noProof/>
+        </w:rPr>
+        <w:t>2</w:t>
+      </w:r>
+      <w:r>
+        <w:rPr>
+          <w:noProof/>
+        </w:rPr>
+        <w:fldChar w:fldCharType="end"/>
+      </w:r>
       <w:r>
         <w:t>. Quy trình kiểm tra, thẩm định và xử lý hồ sơ</w:t>
       </w:r>
@@ -7112,14 +7138,27 @@
       <w:r>
         <w:t xml:space="preserve">Hình </w:t>
       </w:r>
-      <w:fldSimple w:instr=" SEQ Hình \* ARABIC ">
-        <w:r>
-          <w:rPr>
-            <w:noProof/>
-          </w:rPr>
-          <w:t>3</w:t>
-        </w:r>
-      </w:fldSimple>
+      <w:r>
+        <w:fldChar w:fldCharType="begin"/>
+      </w:r>
+      <w:r>
+        <w:instrText xml:space="preserve"> SEQ Hình \* ARABIC </w:instrText>
+      </w:r>
+      <w:r>
+        <w:fldChar w:fldCharType="separate"/>
+      </w:r>
+      <w:r>
+        <w:rPr>
+          <w:noProof/>
+        </w:rPr>
+        <w:t>3</w:t>
+      </w:r>
+      <w:r>
+        <w:rPr>
+          <w:noProof/>
+        </w:rPr>
+        <w:fldChar w:fldCharType="end"/>
+      </w:r>
       <w:r>
         <w:t>. Quy trình phê duyệt và ban hành kết quả</w:t>
       </w:r>
@@ -7340,14 +7379,27 @@
       <w:r>
         <w:t xml:space="preserve">Hình </w:t>
       </w:r>
-      <w:fldSimple w:instr=" SEQ Hình \* ARABIC ">
-        <w:r>
-          <w:rPr>
-            <w:noProof/>
-          </w:rPr>
-          <w:t>4</w:t>
-        </w:r>
-      </w:fldSimple>
+      <w:r>
+        <w:fldChar w:fldCharType="begin"/>
+      </w:r>
+      <w:r>
+        <w:instrText xml:space="preserve"> SEQ Hình \* ARABIC </w:instrText>
+      </w:r>
+      <w:r>
+        <w:fldChar w:fldCharType="separate"/>
+      </w:r>
+      <w:r>
+        <w:rPr>
+          <w:noProof/>
+        </w:rPr>
+        <w:t>4</w:t>
+      </w:r>
+      <w:r>
+        <w:rPr>
+          <w:noProof/>
+        </w:rPr>
+        <w:fldChar w:fldCharType="end"/>
+      </w:r>
       <w:r>
         <w:t>. Quy trình trả kết quả và thông báo</w:t>
       </w:r>
@@ -11765,14 +11817,27 @@
       <w:r>
         <w:t xml:space="preserve">Hình </w:t>
       </w:r>
-      <w:fldSimple w:instr=" SEQ Hình \* ARABIC ">
-        <w:r>
-          <w:rPr>
-            <w:noProof/>
-          </w:rPr>
-          <w:t>5</w:t>
-        </w:r>
-      </w:fldSimple>
+      <w:r>
+        <w:fldChar w:fldCharType="begin"/>
+      </w:r>
+      <w:r>
+        <w:instrText xml:space="preserve"> SEQ Hình \* ARABIC </w:instrText>
+      </w:r>
+      <w:r>
+        <w:fldChar w:fldCharType="separate"/>
+      </w:r>
+      <w:r>
+        <w:rPr>
+          <w:noProof/>
+        </w:rPr>
+        <w:t>5</w:t>
+      </w:r>
+      <w:r>
+        <w:rPr>
+          <w:noProof/>
+        </w:rPr>
+        <w:fldChar w:fldCharType="end"/>
+      </w:r>
       <w:r>
         <w:t>. Mô hình hóa q</w:t>
       </w:r>
@@ -14111,10 +14176,10 @@
           <w:noProof/>
         </w:rPr>
         <w:drawing>
-          <wp:inline distT="0" distB="0" distL="0" distR="0" wp14:anchorId="43A67DA0" wp14:editId="2CC8F86D">
+          <wp:inline distT="0" distB="0" distL="0" distR="0" wp14:anchorId="2C551C4E" wp14:editId="156C6E44">
             <wp:extent cx="5731510" cy="3819525"/>
             <wp:effectExtent l="0" t="0" r="2540" b="9525"/>
-            <wp:docPr id="2" name="Picture 2"/>
+            <wp:docPr id="3" name="Picture 3"/>
             <wp:cNvGraphicFramePr>
               <a:graphicFrameLocks xmlns:a="http://schemas.openxmlformats.org/drawingml/2006/main" noChangeAspect="1"/>
             </wp:cNvGraphicFramePr>
@@ -14122,7 +14187,7 @@
               <a:graphicData uri="http://schemas.openxmlformats.org/drawingml/2006/picture">
                 <pic:pic xmlns:pic="http://schemas.openxmlformats.org/drawingml/2006/picture">
                   <pic:nvPicPr>
-                    <pic:cNvPr id="2" name="QT_THANH_TOAN_V3_03_2608.drawio.png"/>
+                    <pic:cNvPr id="3" name="QT_THANH_TOAN_V3_03_0209.drawio.png"/>
                     <pic:cNvPicPr/>
                   </pic:nvPicPr>
                   <pic:blipFill>
@@ -16392,7 +16457,15 @@
           <w:sz w:val="24"/>
           <w:szCs w:val="24"/>
         </w:rPr>
-        <w:t xml:space="preserve">Tài khoản ngân hàng; </w:t>
+        <w:t>Tài khoả</w:t>
+      </w:r>
+      <w:r>
+        <w:rPr>
+          <w:rFonts w:cs="Times New Roman"/>
+          <w:sz w:val="24"/>
+          <w:szCs w:val="24"/>
+        </w:rPr>
+        <w:t>n ngân hàng</w:t>
       </w:r>
     </w:p>
     <w:p>
@@ -16415,7 +16488,15 @@
           <w:sz w:val="24"/>
           <w:szCs w:val="24"/>
         </w:rPr>
-        <w:t xml:space="preserve">Thẻ ATM nội địa; </w:t>
+        <w:t>Thẻ ATM nội đị</w:t>
+      </w:r>
+      <w:r>
+        <w:rPr>
+          <w:rFonts w:cs="Times New Roman"/>
+          <w:sz w:val="24"/>
+          <w:szCs w:val="24"/>
+        </w:rPr>
+        <w:t>a</w:t>
       </w:r>
     </w:p>
     <w:p>
@@ -16438,7 +16519,7 @@
           <w:sz w:val="24"/>
           <w:szCs w:val="24"/>
         </w:rPr>
-        <w:t xml:space="preserve">Thẻ quốc tế; </w:t>
+        <w:t>Thẻ quốc tế</w:t>
       </w:r>
     </w:p>
     <w:p>
@@ -16461,7 +16542,15 @@
           <w:sz w:val="24"/>
           <w:szCs w:val="24"/>
         </w:rPr>
-        <w:t xml:space="preserve">Ví điện tử hoặc các phương thức thanh toán điện tử khác. </w:t>
+        <w:t>Ví điện tử hoặc các phương thức thanh toán điện tử</w:t>
+      </w:r>
+      <w:r>
+        <w:rPr>
+          <w:rFonts w:cs="Times New Roman"/>
+          <w:sz w:val="24"/>
+          <w:szCs w:val="24"/>
+        </w:rPr>
+        <w:t xml:space="preserve"> khác</w:t>
       </w:r>
     </w:p>
     <w:p>
@@ -18554,7 +18643,7 @@
             <w:noProof/>
             <w:szCs w:val="26"/>
           </w:rPr>
-          <w:t>30</w:t>
+          <w:t>41</w:t>
         </w:r>
         <w:r>
           <w:rPr>
@@ -25721,7 +25810,7 @@
 </file>
 
 <file path=customXml/itemProps1.xml><?xml version="1.0" encoding="utf-8"?>
-<ds:datastoreItem xmlns:ds="http://schemas.openxmlformats.org/officeDocument/2006/customXml" ds:itemID="{D709553D-F22E-4DAE-8F87-E5BE3AB31DAC}">
+<ds:datastoreItem xmlns:ds="http://schemas.openxmlformats.org/officeDocument/2006/customXml" ds:itemID="{5AC263B4-1D53-42A3-BC31-F63DA9EA11AE}">
   <ds:schemaRefs>
     <ds:schemaRef ds:uri="http://schemas.openxmlformats.org/officeDocument/2006/bibliography"/>
   </ds:schemaRefs>

</xml_diff>

<commit_message>
update phân tích định lượng quy trình tiếp nhận
</commit_message>
<xml_diff>
--- a/He_thong_thong_tin_giai_quyet_hanh_chinh/LE THI HOAI THANH_25410307/LeThiHoaiThanh_25410307.docx
+++ b/He_thong_thong_tin_giai_quyet_hanh_chinh/LE THI HOAI THANH_25410307/LeThiHoaiThanh_25410307.docx
@@ -6491,14 +6491,27 @@
       <w:r>
         <w:t xml:space="preserve">Hình </w:t>
       </w:r>
-      <w:fldSimple w:instr=" SEQ Hình \* ARABIC ">
-        <w:r>
-          <w:rPr>
-            <w:noProof/>
-          </w:rPr>
-          <w:t>1</w:t>
-        </w:r>
-      </w:fldSimple>
+      <w:r>
+        <w:fldChar w:fldCharType="begin"/>
+      </w:r>
+      <w:r>
+        <w:instrText xml:space="preserve"> SEQ Hình \* ARABIC </w:instrText>
+      </w:r>
+      <w:r>
+        <w:fldChar w:fldCharType="separate"/>
+      </w:r>
+      <w:r>
+        <w:rPr>
+          <w:noProof/>
+        </w:rPr>
+        <w:t>1</w:t>
+      </w:r>
+      <w:r>
+        <w:rPr>
+          <w:noProof/>
+        </w:rPr>
+        <w:fldChar w:fldCharType="end"/>
+      </w:r>
       <w:r>
         <w:t>. Quy trình tiếp nhận hồ sơ</w:t>
       </w:r>
@@ -6817,14 +6830,27 @@
       <w:r>
         <w:t xml:space="preserve">Hình </w:t>
       </w:r>
-      <w:fldSimple w:instr=" SEQ Hình \* ARABIC ">
-        <w:r>
-          <w:rPr>
-            <w:noProof/>
-          </w:rPr>
-          <w:t>2</w:t>
-        </w:r>
-      </w:fldSimple>
+      <w:r>
+        <w:fldChar w:fldCharType="begin"/>
+      </w:r>
+      <w:r>
+        <w:instrText xml:space="preserve"> SEQ Hình \* ARABIC </w:instrText>
+      </w:r>
+      <w:r>
+        <w:fldChar w:fldCharType="separate"/>
+      </w:r>
+      <w:r>
+        <w:rPr>
+          <w:noProof/>
+        </w:rPr>
+        <w:t>2</w:t>
+      </w:r>
+      <w:r>
+        <w:rPr>
+          <w:noProof/>
+        </w:rPr>
+        <w:fldChar w:fldCharType="end"/>
+      </w:r>
       <w:r>
         <w:t>. Quy trình kiểm tra, thẩm định và xử lý hồ sơ</w:t>
       </w:r>
@@ -7112,14 +7138,27 @@
       <w:r>
         <w:t xml:space="preserve">Hình </w:t>
       </w:r>
-      <w:fldSimple w:instr=" SEQ Hình \* ARABIC ">
-        <w:r>
-          <w:rPr>
-            <w:noProof/>
-          </w:rPr>
-          <w:t>3</w:t>
-        </w:r>
-      </w:fldSimple>
+      <w:r>
+        <w:fldChar w:fldCharType="begin"/>
+      </w:r>
+      <w:r>
+        <w:instrText xml:space="preserve"> SEQ Hình \* ARABIC </w:instrText>
+      </w:r>
+      <w:r>
+        <w:fldChar w:fldCharType="separate"/>
+      </w:r>
+      <w:r>
+        <w:rPr>
+          <w:noProof/>
+        </w:rPr>
+        <w:t>3</w:t>
+      </w:r>
+      <w:r>
+        <w:rPr>
+          <w:noProof/>
+        </w:rPr>
+        <w:fldChar w:fldCharType="end"/>
+      </w:r>
       <w:r>
         <w:t>. Quy trình phê duyệt và ban hành kết quả</w:t>
       </w:r>
@@ -7340,14 +7379,27 @@
       <w:r>
         <w:t xml:space="preserve">Hình </w:t>
       </w:r>
-      <w:fldSimple w:instr=" SEQ Hình \* ARABIC ">
-        <w:r>
-          <w:rPr>
-            <w:noProof/>
-          </w:rPr>
-          <w:t>4</w:t>
-        </w:r>
-      </w:fldSimple>
+      <w:r>
+        <w:fldChar w:fldCharType="begin"/>
+      </w:r>
+      <w:r>
+        <w:instrText xml:space="preserve"> SEQ Hình \* ARABIC </w:instrText>
+      </w:r>
+      <w:r>
+        <w:fldChar w:fldCharType="separate"/>
+      </w:r>
+      <w:r>
+        <w:rPr>
+          <w:noProof/>
+        </w:rPr>
+        <w:t>4</w:t>
+      </w:r>
+      <w:r>
+        <w:rPr>
+          <w:noProof/>
+        </w:rPr>
+        <w:fldChar w:fldCharType="end"/>
+      </w:r>
       <w:r>
         <w:t>. Quy trình trả kết quả và thông báo</w:t>
       </w:r>
@@ -11765,14 +11817,27 @@
       <w:r>
         <w:t xml:space="preserve">Hình </w:t>
       </w:r>
-      <w:fldSimple w:instr=" SEQ Hình \* ARABIC ">
-        <w:r>
-          <w:rPr>
-            <w:noProof/>
-          </w:rPr>
-          <w:t>5</w:t>
-        </w:r>
-      </w:fldSimple>
+      <w:r>
+        <w:fldChar w:fldCharType="begin"/>
+      </w:r>
+      <w:r>
+        <w:instrText xml:space="preserve"> SEQ Hình \* ARABIC </w:instrText>
+      </w:r>
+      <w:r>
+        <w:fldChar w:fldCharType="separate"/>
+      </w:r>
+      <w:r>
+        <w:rPr>
+          <w:noProof/>
+        </w:rPr>
+        <w:t>5</w:t>
+      </w:r>
+      <w:r>
+        <w:rPr>
+          <w:noProof/>
+        </w:rPr>
+        <w:fldChar w:fldCharType="end"/>
+      </w:r>
       <w:r>
         <w:t>. Mô hình hóa q</w:t>
       </w:r>
@@ -14111,10 +14176,10 @@
           <w:noProof/>
         </w:rPr>
         <w:drawing>
-          <wp:inline distT="0" distB="0" distL="0" distR="0" wp14:anchorId="43A67DA0" wp14:editId="2CC8F86D">
+          <wp:inline distT="0" distB="0" distL="0" distR="0" wp14:anchorId="2C551C4E" wp14:editId="156C6E44">
             <wp:extent cx="5731510" cy="3819525"/>
             <wp:effectExtent l="0" t="0" r="2540" b="9525"/>
-            <wp:docPr id="2" name="Picture 2"/>
+            <wp:docPr id="3" name="Picture 3"/>
             <wp:cNvGraphicFramePr>
               <a:graphicFrameLocks xmlns:a="http://schemas.openxmlformats.org/drawingml/2006/main" noChangeAspect="1"/>
             </wp:cNvGraphicFramePr>
@@ -14122,7 +14187,7 @@
               <a:graphicData uri="http://schemas.openxmlformats.org/drawingml/2006/picture">
                 <pic:pic xmlns:pic="http://schemas.openxmlformats.org/drawingml/2006/picture">
                   <pic:nvPicPr>
-                    <pic:cNvPr id="2" name="QT_THANH_TOAN_V3_03_2608.drawio.png"/>
+                    <pic:cNvPr id="3" name="QT_THANH_TOAN_V3_03_0209.drawio.png"/>
                     <pic:cNvPicPr/>
                   </pic:nvPicPr>
                   <pic:blipFill>
@@ -16392,7 +16457,15 @@
           <w:sz w:val="24"/>
           <w:szCs w:val="24"/>
         </w:rPr>
-        <w:t xml:space="preserve">Tài khoản ngân hàng; </w:t>
+        <w:t>Tài khoả</w:t>
+      </w:r>
+      <w:r>
+        <w:rPr>
+          <w:rFonts w:cs="Times New Roman"/>
+          <w:sz w:val="24"/>
+          <w:szCs w:val="24"/>
+        </w:rPr>
+        <w:t>n ngân hàng</w:t>
       </w:r>
     </w:p>
     <w:p>
@@ -16415,7 +16488,15 @@
           <w:sz w:val="24"/>
           <w:szCs w:val="24"/>
         </w:rPr>
-        <w:t xml:space="preserve">Thẻ ATM nội địa; </w:t>
+        <w:t>Thẻ ATM nội đị</w:t>
+      </w:r>
+      <w:r>
+        <w:rPr>
+          <w:rFonts w:cs="Times New Roman"/>
+          <w:sz w:val="24"/>
+          <w:szCs w:val="24"/>
+        </w:rPr>
+        <w:t>a</w:t>
       </w:r>
     </w:p>
     <w:p>
@@ -16438,7 +16519,7 @@
           <w:sz w:val="24"/>
           <w:szCs w:val="24"/>
         </w:rPr>
-        <w:t xml:space="preserve">Thẻ quốc tế; </w:t>
+        <w:t>Thẻ quốc tế</w:t>
       </w:r>
     </w:p>
     <w:p>
@@ -16461,7 +16542,15 @@
           <w:sz w:val="24"/>
           <w:szCs w:val="24"/>
         </w:rPr>
-        <w:t xml:space="preserve">Ví điện tử hoặc các phương thức thanh toán điện tử khác. </w:t>
+        <w:t>Ví điện tử hoặc các phương thức thanh toán điện tử</w:t>
+      </w:r>
+      <w:r>
+        <w:rPr>
+          <w:rFonts w:cs="Times New Roman"/>
+          <w:sz w:val="24"/>
+          <w:szCs w:val="24"/>
+        </w:rPr>
+        <w:t xml:space="preserve"> khác</w:t>
       </w:r>
     </w:p>
     <w:p>
@@ -18554,7 +18643,7 @@
             <w:noProof/>
             <w:szCs w:val="26"/>
           </w:rPr>
-          <w:t>30</w:t>
+          <w:t>41</w:t>
         </w:r>
         <w:r>
           <w:rPr>
@@ -25721,7 +25810,7 @@
 </file>
 
 <file path=customXml/itemProps1.xml><?xml version="1.0" encoding="utf-8"?>
-<ds:datastoreItem xmlns:ds="http://schemas.openxmlformats.org/officeDocument/2006/customXml" ds:itemID="{D709553D-F22E-4DAE-8F87-E5BE3AB31DAC}">
+<ds:datastoreItem xmlns:ds="http://schemas.openxmlformats.org/officeDocument/2006/customXml" ds:itemID="{5AC263B4-1D53-42A3-BC31-F63DA9EA11AE}">
   <ds:schemaRefs>
     <ds:schemaRef ds:uri="http://schemas.openxmlformats.org/officeDocument/2006/bibliography"/>
   </ds:schemaRefs>

</xml_diff>